<commit_message>
docs: Update report documents with latest findings
</commit_message>
<xml_diff>
--- a/docs/Report.docx
+++ b/docs/Report.docx
@@ -89,7 +89,21 @@
         <w:rPr>
           <w:rFonts w:ascii="Times New Roman" w:hAnsi="Times New Roman" w:cs="Times New Roman"/>
         </w:rPr>
-        <w:t>EG/2020/3994 - Jayathilake HACP</w:t>
+        <w:t xml:space="preserve">EG/2020/3994 - </w:t>
+      </w:r>
+      <w:proofErr w:type="spellStart"/>
+      <w:r>
+        <w:rPr>
+          <w:rFonts w:ascii="Times New Roman" w:hAnsi="Times New Roman" w:cs="Times New Roman"/>
+        </w:rPr>
+        <w:t>Jayathilake</w:t>
+      </w:r>
+      <w:proofErr w:type="spellEnd"/>
+      <w:r>
+        <w:rPr>
+          <w:rFonts w:ascii="Times New Roman" w:hAnsi="Times New Roman" w:cs="Times New Roman"/>
+        </w:rPr>
+        <w:t xml:space="preserve"> HACP</w:t>
       </w:r>
     </w:p>
     <w:p>
@@ -107,7 +121,21 @@
         <w:rPr>
           <w:rFonts w:ascii="Times New Roman" w:hAnsi="Times New Roman" w:cs="Times New Roman"/>
         </w:rPr>
-        <w:t>EG/2020/3996 - Jayawardhana MVTI</w:t>
+        <w:t xml:space="preserve">EG/2020/3996 - </w:t>
+      </w:r>
+      <w:proofErr w:type="spellStart"/>
+      <w:r>
+        <w:rPr>
+          <w:rFonts w:ascii="Times New Roman" w:hAnsi="Times New Roman" w:cs="Times New Roman"/>
+        </w:rPr>
+        <w:t>Jayawardhana</w:t>
+      </w:r>
+      <w:proofErr w:type="spellEnd"/>
+      <w:r>
+        <w:rPr>
+          <w:rFonts w:ascii="Times New Roman" w:hAnsi="Times New Roman" w:cs="Times New Roman"/>
+        </w:rPr>
+        <w:t xml:space="preserve"> MVTI</w:t>
       </w:r>
     </w:p>
     <w:p>
@@ -125,7 +153,21 @@
         <w:rPr>
           <w:rFonts w:ascii="Times New Roman" w:hAnsi="Times New Roman" w:cs="Times New Roman"/>
         </w:rPr>
-        <w:t>EG/2020/4040 - Lakpahana AGS</w:t>
+        <w:t xml:space="preserve">EG/2020/4040 - </w:t>
+      </w:r>
+      <w:proofErr w:type="spellStart"/>
+      <w:r>
+        <w:rPr>
+          <w:rFonts w:ascii="Times New Roman" w:hAnsi="Times New Roman" w:cs="Times New Roman"/>
+        </w:rPr>
+        <w:t>Lakpahana</w:t>
+      </w:r>
+      <w:proofErr w:type="spellEnd"/>
+      <w:r>
+        <w:rPr>
+          <w:rFonts w:ascii="Times New Roman" w:hAnsi="Times New Roman" w:cs="Times New Roman"/>
+        </w:rPr>
+        <w:t xml:space="preserve"> AGS</w:t>
       </w:r>
     </w:p>
     <w:p>
@@ -193,8 +235,8 @@
       <w:pPr>
         <w:pStyle w:val="Compact"/>
         <w:rPr>
-          <w:rFonts w:ascii="Times New Roman" w:hAnsi="Times New Roman" w:cs="Times New Roman"/>
-          <w:color w:val="4F81BD" w:themeColor="accent1"/>
+          <w:rStyle w:val="Hyperlink"/>
+          <w:rFonts w:ascii="Times New Roman" w:hAnsi="Times New Roman" w:cs="Times New Roman"/>
         </w:rPr>
       </w:pPr>
       <w:r>
@@ -217,13 +259,95 @@
     </w:p>
     <w:p>
       <w:pPr>
+        <w:pStyle w:val="Compact"/>
+        <w:rPr>
+          <w:rFonts w:ascii="Times New Roman" w:hAnsi="Times New Roman" w:cs="Times New Roman"/>
+          <w:color w:val="4F81BD" w:themeColor="accent1"/>
+        </w:rPr>
+      </w:pPr>
+      <w:r>
+        <w:rPr>
+          <w:rFonts w:ascii="Times New Roman" w:hAnsi="Times New Roman" w:cs="Times New Roman"/>
+          <w:b/>
+          <w:bCs/>
+        </w:rPr>
+        <w:t>Yo</w:t>
+      </w:r>
+      <w:r>
+        <w:rPr>
+          <w:rFonts w:ascii="Times New Roman" w:hAnsi="Times New Roman" w:cs="Times New Roman"/>
+          <w:b/>
+          <w:bCs/>
+        </w:rPr>
+        <w:t>uTube V</w:t>
+      </w:r>
+      <w:r>
+        <w:rPr>
+          <w:rFonts w:ascii="Times New Roman" w:hAnsi="Times New Roman" w:cs="Times New Roman"/>
+          <w:b/>
+          <w:bCs/>
+        </w:rPr>
+        <w:t>i</w:t>
+      </w:r>
+      <w:r>
+        <w:rPr>
+          <w:rFonts w:ascii="Times New Roman" w:hAnsi="Times New Roman" w:cs="Times New Roman"/>
+          <w:b/>
+          <w:bCs/>
+        </w:rPr>
+        <w:t>deo</w:t>
+      </w:r>
+      <w:r>
+        <w:rPr>
+          <w:rFonts w:ascii="Times New Roman" w:hAnsi="Times New Roman" w:cs="Times New Roman"/>
+          <w:color w:val="4F81BD" w:themeColor="accent1"/>
+        </w:rPr>
+        <w:t xml:space="preserve">: </w:t>
+      </w:r>
+      <w:hyperlink r:id="rId9" w:history="1">
+        <w:r>
+          <w:rPr>
+            <w:rStyle w:val="Hyperlink"/>
+            <w:rFonts w:ascii="Times New Roman" w:hAnsi="Times New Roman" w:cs="Times New Roman"/>
+          </w:rPr>
+          <w:t>https://youtu.be/S7JR83</w:t>
+        </w:r>
+        <w:bookmarkStart w:id="3" w:name="_GoBack"/>
+        <w:bookmarkEnd w:id="3"/>
+        <w:r>
+          <w:rPr>
+            <w:rStyle w:val="Hyperlink"/>
+            <w:rFonts w:ascii="Times New Roman" w:hAnsi="Times New Roman" w:cs="Times New Roman"/>
+          </w:rPr>
+          <w:t>t</w:t>
+        </w:r>
+        <w:r>
+          <w:rPr>
+            <w:rStyle w:val="Hyperlink"/>
+            <w:rFonts w:ascii="Times New Roman" w:hAnsi="Times New Roman" w:cs="Times New Roman"/>
+          </w:rPr>
+          <w:t>jYH4</w:t>
+        </w:r>
+      </w:hyperlink>
+    </w:p>
+    <w:p>
+      <w:pPr>
+        <w:pStyle w:val="Compact"/>
+        <w:rPr>
+          <w:rFonts w:ascii="Times New Roman" w:hAnsi="Times New Roman" w:cs="Times New Roman"/>
+          <w:color w:val="4F81BD" w:themeColor="accent1"/>
+        </w:rPr>
+      </w:pPr>
+    </w:p>
+    <w:p>
+      <w:pPr>
         <w:pStyle w:val="Heading2"/>
         <w:rPr>
           <w:rFonts w:ascii="Times New Roman" w:hAnsi="Times New Roman" w:cs="Times New Roman"/>
           <w:color w:val="auto"/>
         </w:rPr>
       </w:pPr>
-      <w:bookmarkStart w:id="3" w:name="X84ae5307afdcb91e5cb9cf377f77256e37799e6"/>
+      <w:bookmarkStart w:id="4" w:name="X84ae5307afdcb91e5cb9cf377f77256e37799e6"/>
       <w:bookmarkEnd w:id="1"/>
       <w:bookmarkEnd w:id="2"/>
       <w:r>
@@ -242,7 +366,7 @@
           <w:color w:val="auto"/>
         </w:rPr>
       </w:pPr>
-      <w:bookmarkStart w:id="4" w:name="real-world-context"/>
+      <w:bookmarkStart w:id="5" w:name="real-world-context"/>
       <w:r>
         <w:rPr>
           <w:rFonts w:ascii="Times New Roman" w:hAnsi="Times New Roman" w:cs="Times New Roman"/>
@@ -391,8 +515,8 @@
           <w:color w:val="auto"/>
         </w:rPr>
       </w:pPr>
-      <w:bookmarkStart w:id="5" w:name="industrial-challenges"/>
-      <w:bookmarkEnd w:id="4"/>
+      <w:bookmarkStart w:id="6" w:name="industrial-challenges"/>
+      <w:bookmarkEnd w:id="5"/>
       <w:r>
         <w:rPr>
           <w:rFonts w:ascii="Times New Roman" w:hAnsi="Times New Roman" w:cs="Times New Roman"/>
@@ -527,8 +651,8 @@
           <w:color w:val="auto"/>
         </w:rPr>
       </w:pPr>
-      <w:bookmarkStart w:id="6" w:name="our-functional-solution"/>
-      <w:bookmarkEnd w:id="5"/>
+      <w:bookmarkStart w:id="7" w:name="our-functional-solution"/>
+      <w:bookmarkEnd w:id="6"/>
       <w:r>
         <w:rPr>
           <w:rFonts w:ascii="Times New Roman" w:hAnsi="Times New Roman" w:cs="Times New Roman"/>
@@ -652,6 +776,7 @@
         <w:rPr>
           <w:rFonts w:ascii="Times New Roman" w:hAnsi="Times New Roman" w:cs="Times New Roman"/>
         </w:rPr>
+        <w:lastRenderedPageBreak/>
         <w:t>The analyzer processes Apache/Nginx Combined Log Format, extracting metrics such as traffic patterns, error distributions, anomaly detection, and user session analysis.</w:t>
       </w:r>
     </w:p>
@@ -663,15 +788,14 @@
           <w:color w:val="auto"/>
         </w:rPr>
       </w:pPr>
-      <w:bookmarkStart w:id="7" w:name="functional-design"/>
-      <w:bookmarkEnd w:id="3"/>
-      <w:bookmarkEnd w:id="6"/>
+      <w:bookmarkStart w:id="8" w:name="functional-design"/>
+      <w:bookmarkEnd w:id="4"/>
+      <w:bookmarkEnd w:id="7"/>
       <w:r>
         <w:rPr>
           <w:rFonts w:ascii="Times New Roman" w:hAnsi="Times New Roman" w:cs="Times New Roman"/>
           <w:color w:val="auto"/>
         </w:rPr>
-        <w:lastRenderedPageBreak/>
         <w:t>2. Functional Design</w:t>
       </w:r>
     </w:p>
@@ -683,7 +807,7 @@
           <w:color w:val="auto"/>
         </w:rPr>
       </w:pPr>
-      <w:bookmarkStart w:id="8" w:name="system-architecture"/>
+      <w:bookmarkStart w:id="9" w:name="system-architecture"/>
       <w:r>
         <w:rPr>
           <w:rFonts w:ascii="Times New Roman" w:hAnsi="Times New Roman" w:cs="Times New Roman"/>
@@ -749,7 +873,7 @@
                     <pic:cNvPicPr/>
                   </pic:nvPicPr>
                   <pic:blipFill>
-                    <a:blip r:embed="rId9"/>
+                    <a:blip r:embed="rId10"/>
                     <a:stretch>
                       <a:fillRect/>
                     </a:stretch>
@@ -814,8 +938,8 @@
           <w:color w:val="auto"/>
         </w:rPr>
       </w:pPr>
-      <w:bookmarkStart w:id="9" w:name="core-data-types-adts"/>
-      <w:bookmarkEnd w:id="8"/>
+      <w:bookmarkStart w:id="10" w:name="core-data-types-adts"/>
+      <w:bookmarkEnd w:id="9"/>
       <w:r>
         <w:rPr>
           <w:rFonts w:ascii="Times New Roman" w:hAnsi="Times New Roman" w:cs="Times New Roman"/>
@@ -991,8 +1115,8 @@
         </w:rPr>
         <w:t>: Aggregated analysis results with strict evaluation for parallel processing.</w:t>
       </w:r>
-      <w:bookmarkStart w:id="10" w:name="main-functions-with-type-signatures"/>
-      <w:bookmarkEnd w:id="9"/>
+      <w:bookmarkStart w:id="11" w:name="main-functions-with-type-signatures"/>
+      <w:bookmarkEnd w:id="10"/>
     </w:p>
     <w:p>
       <w:pPr>
@@ -1038,6 +1162,7 @@
           <w:rStyle w:val="CommentTok"/>
           <w:rFonts w:ascii="Times New Roman" w:hAnsi="Times New Roman" w:cs="Times New Roman"/>
         </w:rPr>
+        <w:lastRenderedPageBreak/>
         <w:t>-- Parse a single log line using regex pattern matching</w:t>
       </w:r>
       <w:r>
@@ -1046,12 +1171,21 @@
         </w:rPr>
         <w:br/>
       </w:r>
-      <w:r>
-        <w:rPr>
-          <w:rStyle w:val="OtherTok"/>
-          <w:rFonts w:ascii="Times New Roman" w:hAnsi="Times New Roman" w:cs="Times New Roman"/>
-        </w:rPr>
-        <w:t>parseLogLine ::</w:t>
+      <w:proofErr w:type="spellStart"/>
+      <w:r>
+        <w:rPr>
+          <w:rStyle w:val="OtherTok"/>
+          <w:rFonts w:ascii="Times New Roman" w:hAnsi="Times New Roman" w:cs="Times New Roman"/>
+        </w:rPr>
+        <w:t>parseLogLine</w:t>
+      </w:r>
+      <w:proofErr w:type="spellEnd"/>
+      <w:r>
+        <w:rPr>
+          <w:rStyle w:val="OtherTok"/>
+          <w:rFonts w:ascii="Times New Roman" w:hAnsi="Times New Roman" w:cs="Times New Roman"/>
+        </w:rPr>
+        <w:t xml:space="preserve"> ::</w:t>
       </w:r>
       <w:r>
         <w:rPr>
@@ -1102,6 +1236,7 @@
         </w:rPr>
         <w:t xml:space="preserve"> </w:t>
       </w:r>
+      <w:proofErr w:type="spellStart"/>
       <w:r>
         <w:rPr>
           <w:rStyle w:val="DataTypeTok"/>
@@ -1109,6 +1244,7 @@
         </w:rPr>
         <w:t>LogEntry</w:t>
       </w:r>
+      <w:proofErr w:type="spellEnd"/>
       <w:r>
         <w:rPr>
           <w:rFonts w:ascii="Times New Roman" w:hAnsi="Times New Roman" w:cs="Times New Roman"/>
@@ -1119,7 +1255,6 @@
         <w:rPr>
           <w:rFonts w:ascii="Times New Roman" w:hAnsi="Times New Roman" w:cs="Times New Roman"/>
         </w:rPr>
-        <w:lastRenderedPageBreak/>
         <w:br/>
       </w:r>
       <w:r>
@@ -1135,12 +1270,21 @@
         </w:rPr>
         <w:br/>
       </w:r>
-      <w:r>
-        <w:rPr>
-          <w:rStyle w:val="OtherTok"/>
-          <w:rFonts w:ascii="Times New Roman" w:hAnsi="Times New Roman" w:cs="Times New Roman"/>
-        </w:rPr>
-        <w:t>parseLogFile ::</w:t>
+      <w:proofErr w:type="spellStart"/>
+      <w:r>
+        <w:rPr>
+          <w:rStyle w:val="OtherTok"/>
+          <w:rFonts w:ascii="Times New Roman" w:hAnsi="Times New Roman" w:cs="Times New Roman"/>
+        </w:rPr>
+        <w:t>parseLogFile</w:t>
+      </w:r>
+      <w:proofErr w:type="spellEnd"/>
+      <w:r>
+        <w:rPr>
+          <w:rStyle w:val="OtherTok"/>
+          <w:rFonts w:ascii="Times New Roman" w:hAnsi="Times New Roman" w:cs="Times New Roman"/>
+        </w:rPr>
+        <w:t xml:space="preserve"> ::</w:t>
       </w:r>
       <w:r>
         <w:rPr>
@@ -1177,6 +1321,7 @@
         </w:rPr>
         <w:t xml:space="preserve"> [</w:t>
       </w:r>
+      <w:proofErr w:type="spellStart"/>
       <w:r>
         <w:rPr>
           <w:rStyle w:val="DataTypeTok"/>
@@ -1184,6 +1329,7 @@
         </w:rPr>
         <w:t>LogEntry</w:t>
       </w:r>
+      <w:proofErr w:type="spellEnd"/>
       <w:r>
         <w:rPr>
           <w:rStyle w:val="NormalTok"/>
@@ -1216,12 +1362,21 @@
         </w:rPr>
         <w:br/>
       </w:r>
-      <w:r>
-        <w:rPr>
-          <w:rStyle w:val="OtherTok"/>
-          <w:rFonts w:ascii="Times New Roman" w:hAnsi="Times New Roman" w:cs="Times New Roman"/>
-        </w:rPr>
-        <w:t>parseLogFileWithStats ::</w:t>
+      <w:proofErr w:type="spellStart"/>
+      <w:r>
+        <w:rPr>
+          <w:rStyle w:val="OtherTok"/>
+          <w:rFonts w:ascii="Times New Roman" w:hAnsi="Times New Roman" w:cs="Times New Roman"/>
+        </w:rPr>
+        <w:t>parseLogFileWithStats</w:t>
+      </w:r>
+      <w:proofErr w:type="spellEnd"/>
+      <w:r>
+        <w:rPr>
+          <w:rStyle w:val="OtherTok"/>
+          <w:rFonts w:ascii="Times New Roman" w:hAnsi="Times New Roman" w:cs="Times New Roman"/>
+        </w:rPr>
+        <w:t xml:space="preserve"> ::</w:t>
       </w:r>
       <w:r>
         <w:rPr>
@@ -1258,6 +1413,7 @@
         </w:rPr>
         <w:t xml:space="preserve"> ([</w:t>
       </w:r>
+      <w:proofErr w:type="spellStart"/>
       <w:r>
         <w:rPr>
           <w:rStyle w:val="DataTypeTok"/>
@@ -1265,6 +1421,7 @@
         </w:rPr>
         <w:t>LogEntry</w:t>
       </w:r>
+      <w:proofErr w:type="spellEnd"/>
       <w:r>
         <w:rPr>
           <w:rStyle w:val="NormalTok"/>
@@ -1325,12 +1482,21 @@
         </w:rPr>
         <w:br/>
       </w:r>
-      <w:r>
-        <w:rPr>
-          <w:rStyle w:val="OtherTok"/>
-          <w:rFonts w:ascii="Times New Roman" w:hAnsi="Times New Roman" w:cs="Times New Roman"/>
-        </w:rPr>
-        <w:t>parseTimestamp ::</w:t>
+      <w:proofErr w:type="spellStart"/>
+      <w:r>
+        <w:rPr>
+          <w:rStyle w:val="OtherTok"/>
+          <w:rFonts w:ascii="Times New Roman" w:hAnsi="Times New Roman" w:cs="Times New Roman"/>
+        </w:rPr>
+        <w:t>parseTimestamp</w:t>
+      </w:r>
+      <w:proofErr w:type="spellEnd"/>
+      <w:r>
+        <w:rPr>
+          <w:rStyle w:val="OtherTok"/>
+          <w:rFonts w:ascii="Times New Roman" w:hAnsi="Times New Roman" w:cs="Times New Roman"/>
+        </w:rPr>
+        <w:t xml:space="preserve"> ::</w:t>
       </w:r>
       <w:r>
         <w:rPr>
@@ -1381,6 +1547,7 @@
         </w:rPr>
         <w:t xml:space="preserve"> </w:t>
       </w:r>
+      <w:proofErr w:type="spellStart"/>
       <w:r>
         <w:rPr>
           <w:rStyle w:val="DataTypeTok"/>
@@ -1388,6 +1555,7 @@
         </w:rPr>
         <w:t>UTCTime</w:t>
       </w:r>
+      <w:proofErr w:type="spellEnd"/>
       <w:r>
         <w:rPr>
           <w:rFonts w:ascii="Times New Roman" w:hAnsi="Times New Roman" w:cs="Times New Roman"/>
@@ -1413,12 +1581,21 @@
         </w:rPr>
         <w:br/>
       </w:r>
-      <w:r>
-        <w:rPr>
-          <w:rStyle w:val="OtherTok"/>
-          <w:rFonts w:ascii="Times New Roman" w:hAnsi="Times New Roman" w:cs="Times New Roman"/>
-        </w:rPr>
-        <w:t>parseMethod ::</w:t>
+      <w:proofErr w:type="spellStart"/>
+      <w:r>
+        <w:rPr>
+          <w:rStyle w:val="OtherTok"/>
+          <w:rFonts w:ascii="Times New Roman" w:hAnsi="Times New Roman" w:cs="Times New Roman"/>
+        </w:rPr>
+        <w:t>parseMethod</w:t>
+      </w:r>
+      <w:proofErr w:type="spellEnd"/>
+      <w:r>
+        <w:rPr>
+          <w:rStyle w:val="OtherTok"/>
+          <w:rFonts w:ascii="Times New Roman" w:hAnsi="Times New Roman" w:cs="Times New Roman"/>
+        </w:rPr>
+        <w:t xml:space="preserve"> ::</w:t>
       </w:r>
       <w:r>
         <w:rPr>
@@ -1469,6 +1646,7 @@
         </w:rPr>
         <w:t xml:space="preserve"> </w:t>
       </w:r>
+      <w:proofErr w:type="spellStart"/>
       <w:r>
         <w:rPr>
           <w:rStyle w:val="DataTypeTok"/>
@@ -1476,6 +1654,7 @@
         </w:rPr>
         <w:t>HttpMethod</w:t>
       </w:r>
+      <w:proofErr w:type="spellEnd"/>
     </w:p>
     <w:p>
       <w:pPr>
@@ -1513,12 +1692,21 @@
         </w:rPr>
         <w:br/>
       </w:r>
-      <w:r>
-        <w:rPr>
-          <w:rStyle w:val="OtherTok"/>
-          <w:rFonts w:ascii="Times New Roman" w:hAnsi="Times New Roman" w:cs="Times New Roman"/>
-        </w:rPr>
-        <w:t>countByLevel ::</w:t>
+      <w:proofErr w:type="spellStart"/>
+      <w:r>
+        <w:rPr>
+          <w:rStyle w:val="OtherTok"/>
+          <w:rFonts w:ascii="Times New Roman" w:hAnsi="Times New Roman" w:cs="Times New Roman"/>
+        </w:rPr>
+        <w:t>countByLevel</w:t>
+      </w:r>
+      <w:proofErr w:type="spellEnd"/>
+      <w:r>
+        <w:rPr>
+          <w:rStyle w:val="OtherTok"/>
+          <w:rFonts w:ascii="Times New Roman" w:hAnsi="Times New Roman" w:cs="Times New Roman"/>
+        </w:rPr>
+        <w:t xml:space="preserve"> ::</w:t>
       </w:r>
       <w:r>
         <w:rPr>
@@ -1527,6 +1715,7 @@
         </w:rPr>
         <w:t xml:space="preserve"> [</w:t>
       </w:r>
+      <w:proofErr w:type="spellStart"/>
       <w:r>
         <w:rPr>
           <w:rStyle w:val="DataTypeTok"/>
@@ -1534,6 +1723,7 @@
         </w:rPr>
         <w:t>LogEntry</w:t>
       </w:r>
+      <w:proofErr w:type="spellEnd"/>
       <w:r>
         <w:rPr>
           <w:rStyle w:val="NormalTok"/>
@@ -1569,6 +1759,7 @@
         </w:rPr>
         <w:t xml:space="preserve"> </w:t>
       </w:r>
+      <w:proofErr w:type="spellStart"/>
       <w:r>
         <w:rPr>
           <w:rStyle w:val="DataTypeTok"/>
@@ -1576,6 +1767,7 @@
         </w:rPr>
         <w:t>StatusCategory</w:t>
       </w:r>
+      <w:proofErr w:type="spellEnd"/>
       <w:r>
         <w:rPr>
           <w:rStyle w:val="NormalTok"/>
@@ -1615,12 +1807,21 @@
         </w:rPr>
         <w:br/>
       </w:r>
-      <w:r>
-        <w:rPr>
-          <w:rStyle w:val="OtherTok"/>
-          <w:rFonts w:ascii="Times New Roman" w:hAnsi="Times New Roman" w:cs="Times New Roman"/>
-        </w:rPr>
-        <w:t>topIPs ::</w:t>
+      <w:proofErr w:type="spellStart"/>
+      <w:r>
+        <w:rPr>
+          <w:rStyle w:val="OtherTok"/>
+          <w:rFonts w:ascii="Times New Roman" w:hAnsi="Times New Roman" w:cs="Times New Roman"/>
+        </w:rPr>
+        <w:t>topIPs</w:t>
+      </w:r>
+      <w:proofErr w:type="spellEnd"/>
+      <w:r>
+        <w:rPr>
+          <w:rStyle w:val="OtherTok"/>
+          <w:rFonts w:ascii="Times New Roman" w:hAnsi="Times New Roman" w:cs="Times New Roman"/>
+        </w:rPr>
+        <w:t xml:space="preserve"> ::</w:t>
       </w:r>
       <w:r>
         <w:rPr>
@@ -1657,6 +1858,7 @@
         </w:rPr>
         <w:t xml:space="preserve"> [</w:t>
       </w:r>
+      <w:proofErr w:type="spellStart"/>
       <w:r>
         <w:rPr>
           <w:rStyle w:val="DataTypeTok"/>
@@ -1664,6 +1866,7 @@
         </w:rPr>
         <w:t>LogEntry</w:t>
       </w:r>
+      <w:proofErr w:type="spellEnd"/>
       <w:r>
         <w:rPr>
           <w:rStyle w:val="NormalTok"/>
@@ -1738,20 +1941,30 @@
         </w:rPr>
         <w:br/>
       </w:r>
-      <w:r>
-        <w:rPr>
-          <w:rStyle w:val="OtherTok"/>
-          <w:rFonts w:ascii="Times New Roman" w:hAnsi="Times New Roman" w:cs="Times New Roman"/>
-        </w:rPr>
-        <w:t>errorsOverTime ::</w:t>
-      </w:r>
-      <w:r>
-        <w:rPr>
-          <w:rStyle w:val="NormalTok"/>
-          <w:rFonts w:ascii="Times New Roman" w:hAnsi="Times New Roman" w:cs="Times New Roman"/>
-        </w:rPr>
-        <w:t xml:space="preserve"> </w:t>
-      </w:r>
+      <w:proofErr w:type="spellStart"/>
+      <w:r>
+        <w:rPr>
+          <w:rStyle w:val="OtherTok"/>
+          <w:rFonts w:ascii="Times New Roman" w:hAnsi="Times New Roman" w:cs="Times New Roman"/>
+        </w:rPr>
+        <w:t>errorsOverTime</w:t>
+      </w:r>
+      <w:proofErr w:type="spellEnd"/>
+      <w:r>
+        <w:rPr>
+          <w:rStyle w:val="OtherTok"/>
+          <w:rFonts w:ascii="Times New Roman" w:hAnsi="Times New Roman" w:cs="Times New Roman"/>
+        </w:rPr>
+        <w:t xml:space="preserve"> ::</w:t>
+      </w:r>
+      <w:r>
+        <w:rPr>
+          <w:rStyle w:val="NormalTok"/>
+          <w:rFonts w:ascii="Times New Roman" w:hAnsi="Times New Roman" w:cs="Times New Roman"/>
+        </w:rPr>
+        <w:t xml:space="preserve"> </w:t>
+      </w:r>
+      <w:proofErr w:type="spellStart"/>
       <w:r>
         <w:rPr>
           <w:rStyle w:val="DataTypeTok"/>
@@ -1759,6 +1972,7 @@
         </w:rPr>
         <w:t>NominalDiffTime</w:t>
       </w:r>
+      <w:proofErr w:type="spellEnd"/>
       <w:r>
         <w:rPr>
           <w:rStyle w:val="NormalTok"/>
@@ -1780,6 +1994,7 @@
         </w:rPr>
         <w:t xml:space="preserve"> [</w:t>
       </w:r>
+      <w:proofErr w:type="spellStart"/>
       <w:r>
         <w:rPr>
           <w:rStyle w:val="DataTypeTok"/>
@@ -1787,6 +2002,7 @@
         </w:rPr>
         <w:t>LogEntry</w:t>
       </w:r>
+      <w:proofErr w:type="spellEnd"/>
       <w:r>
         <w:rPr>
           <w:rStyle w:val="NormalTok"/>
@@ -1808,6 +2024,7 @@
         </w:rPr>
         <w:t xml:space="preserve"> [(</w:t>
       </w:r>
+      <w:proofErr w:type="spellStart"/>
       <w:r>
         <w:rPr>
           <w:rStyle w:val="DataTypeTok"/>
@@ -1815,6 +2032,7 @@
         </w:rPr>
         <w:t>UTCTime</w:t>
       </w:r>
+      <w:proofErr w:type="spellEnd"/>
       <w:r>
         <w:rPr>
           <w:rStyle w:val="NormalTok"/>
@@ -1861,20 +2079,30 @@
         </w:rPr>
         <w:br/>
       </w:r>
-      <w:r>
-        <w:rPr>
-          <w:rStyle w:val="OtherTok"/>
-          <w:rFonts w:ascii="Times New Roman" w:hAnsi="Times New Roman" w:cs="Times New Roman"/>
-        </w:rPr>
-        <w:t>sessionize ::</w:t>
-      </w:r>
-      <w:r>
-        <w:rPr>
-          <w:rStyle w:val="NormalTok"/>
-          <w:rFonts w:ascii="Times New Roman" w:hAnsi="Times New Roman" w:cs="Times New Roman"/>
-        </w:rPr>
-        <w:t xml:space="preserve"> </w:t>
-      </w:r>
+      <w:proofErr w:type="spellStart"/>
+      <w:r>
+        <w:rPr>
+          <w:rStyle w:val="OtherTok"/>
+          <w:rFonts w:ascii="Times New Roman" w:hAnsi="Times New Roman" w:cs="Times New Roman"/>
+        </w:rPr>
+        <w:t>sessionize</w:t>
+      </w:r>
+      <w:proofErr w:type="spellEnd"/>
+      <w:r>
+        <w:rPr>
+          <w:rStyle w:val="OtherTok"/>
+          <w:rFonts w:ascii="Times New Roman" w:hAnsi="Times New Roman" w:cs="Times New Roman"/>
+        </w:rPr>
+        <w:t xml:space="preserve"> ::</w:t>
+      </w:r>
+      <w:r>
+        <w:rPr>
+          <w:rStyle w:val="NormalTok"/>
+          <w:rFonts w:ascii="Times New Roman" w:hAnsi="Times New Roman" w:cs="Times New Roman"/>
+        </w:rPr>
+        <w:t xml:space="preserve"> </w:t>
+      </w:r>
+      <w:proofErr w:type="spellStart"/>
       <w:r>
         <w:rPr>
           <w:rStyle w:val="DataTypeTok"/>
@@ -1882,6 +2110,7 @@
         </w:rPr>
         <w:t>NominalDiffTime</w:t>
       </w:r>
+      <w:proofErr w:type="spellEnd"/>
       <w:r>
         <w:rPr>
           <w:rStyle w:val="NormalTok"/>
@@ -1903,6 +2132,7 @@
         </w:rPr>
         <w:t xml:space="preserve"> [</w:t>
       </w:r>
+      <w:proofErr w:type="spellStart"/>
       <w:r>
         <w:rPr>
           <w:rStyle w:val="DataTypeTok"/>
@@ -1910,6 +2140,7 @@
         </w:rPr>
         <w:t>LogEntry</w:t>
       </w:r>
+      <w:proofErr w:type="spellEnd"/>
       <w:r>
         <w:rPr>
           <w:rStyle w:val="NormalTok"/>
@@ -1931,6 +2162,7 @@
         </w:rPr>
         <w:t xml:space="preserve"> [[</w:t>
       </w:r>
+      <w:proofErr w:type="spellStart"/>
       <w:r>
         <w:rPr>
           <w:rStyle w:val="DataTypeTok"/>
@@ -1938,6 +2170,7 @@
         </w:rPr>
         <w:t>LogEntry</w:t>
       </w:r>
+      <w:proofErr w:type="spellEnd"/>
       <w:r>
         <w:rPr>
           <w:rStyle w:val="NormalTok"/>
@@ -1970,12 +2203,21 @@
         </w:rPr>
         <w:br/>
       </w:r>
-      <w:r>
-        <w:rPr>
-          <w:rStyle w:val="OtherTok"/>
-          <w:rFonts w:ascii="Times New Roman" w:hAnsi="Times New Roman" w:cs="Times New Roman"/>
-        </w:rPr>
-        <w:t>computeAnomalies ::</w:t>
+      <w:proofErr w:type="spellStart"/>
+      <w:r>
+        <w:rPr>
+          <w:rStyle w:val="OtherTok"/>
+          <w:rFonts w:ascii="Times New Roman" w:hAnsi="Times New Roman" w:cs="Times New Roman"/>
+        </w:rPr>
+        <w:t>computeAnomalies</w:t>
+      </w:r>
+      <w:proofErr w:type="spellEnd"/>
+      <w:r>
+        <w:rPr>
+          <w:rStyle w:val="OtherTok"/>
+          <w:rFonts w:ascii="Times New Roman" w:hAnsi="Times New Roman" w:cs="Times New Roman"/>
+        </w:rPr>
+        <w:t xml:space="preserve"> ::</w:t>
       </w:r>
       <w:r>
         <w:rPr>
@@ -1984,6 +2226,7 @@
         </w:rPr>
         <w:t xml:space="preserve"> [</w:t>
       </w:r>
+      <w:proofErr w:type="spellStart"/>
       <w:r>
         <w:rPr>
           <w:rStyle w:val="DataTypeTok"/>
@@ -1991,6 +2234,7 @@
         </w:rPr>
         <w:t>LogEntry</w:t>
       </w:r>
+      <w:proofErr w:type="spellEnd"/>
       <w:r>
         <w:rPr>
           <w:rStyle w:val="NormalTok"/>
@@ -2051,12 +2295,21 @@
         </w:rPr>
         <w:br/>
       </w:r>
-      <w:r>
-        <w:rPr>
-          <w:rStyle w:val="OtherTok"/>
-          <w:rFonts w:ascii="Times New Roman" w:hAnsi="Times New Roman" w:cs="Times New Roman"/>
-        </w:rPr>
-        <w:t>processLogs ::</w:t>
+      <w:proofErr w:type="spellStart"/>
+      <w:r>
+        <w:rPr>
+          <w:rStyle w:val="OtherTok"/>
+          <w:rFonts w:ascii="Times New Roman" w:hAnsi="Times New Roman" w:cs="Times New Roman"/>
+        </w:rPr>
+        <w:t>processLogs</w:t>
+      </w:r>
+      <w:proofErr w:type="spellEnd"/>
+      <w:r>
+        <w:rPr>
+          <w:rStyle w:val="OtherTok"/>
+          <w:rFonts w:ascii="Times New Roman" w:hAnsi="Times New Roman" w:cs="Times New Roman"/>
+        </w:rPr>
+        <w:t xml:space="preserve"> ::</w:t>
       </w:r>
       <w:r>
         <w:rPr>
@@ -2065,6 +2318,7 @@
         </w:rPr>
         <w:t xml:space="preserve"> [</w:t>
       </w:r>
+      <w:proofErr w:type="spellStart"/>
       <w:r>
         <w:rPr>
           <w:rStyle w:val="DataTypeTok"/>
@@ -2072,6 +2326,7 @@
         </w:rPr>
         <w:t>LogEntry</w:t>
       </w:r>
+      <w:proofErr w:type="spellEnd"/>
       <w:r>
         <w:rPr>
           <w:rStyle w:val="NormalTok"/>
@@ -2093,6 +2348,7 @@
         </w:rPr>
         <w:t xml:space="preserve"> </w:t>
       </w:r>
+      <w:proofErr w:type="spellStart"/>
       <w:r>
         <w:rPr>
           <w:rStyle w:val="DataTypeTok"/>
@@ -2100,6 +2356,7 @@
         </w:rPr>
         <w:t>AnalysisResult</w:t>
       </w:r>
+      <w:proofErr w:type="spellEnd"/>
     </w:p>
     <w:p>
       <w:pPr>
@@ -2137,20 +2394,39 @@
         </w:rPr>
         <w:br/>
       </w:r>
-      <w:r>
-        <w:rPr>
-          <w:rStyle w:val="OtherTok"/>
-          <w:rFonts w:ascii="Times New Roman" w:hAnsi="Times New Roman" w:cs="Times New Roman"/>
-        </w:rPr>
-        <w:t>readLogFile ::</w:t>
-      </w:r>
-      <w:r>
-        <w:rPr>
-          <w:rStyle w:val="NormalTok"/>
-          <w:rFonts w:ascii="Times New Roman" w:hAnsi="Times New Roman" w:cs="Times New Roman"/>
-        </w:rPr>
-        <w:t xml:space="preserve"> </w:t>
-      </w:r>
+      <w:proofErr w:type="spellStart"/>
+      <w:proofErr w:type="gramStart"/>
+      <w:r>
+        <w:rPr>
+          <w:rStyle w:val="OtherTok"/>
+          <w:rFonts w:ascii="Times New Roman" w:hAnsi="Times New Roman" w:cs="Times New Roman"/>
+        </w:rPr>
+        <w:t>readLogFile</w:t>
+      </w:r>
+      <w:proofErr w:type="spellEnd"/>
+      <w:r>
+        <w:rPr>
+          <w:rStyle w:val="OtherTok"/>
+          <w:rFonts w:ascii="Times New Roman" w:hAnsi="Times New Roman" w:cs="Times New Roman"/>
+        </w:rPr>
+        <w:t xml:space="preserve"> :</w:t>
+      </w:r>
+      <w:proofErr w:type="gramEnd"/>
+      <w:r>
+        <w:rPr>
+          <w:rStyle w:val="OtherTok"/>
+          <w:rFonts w:ascii="Times New Roman" w:hAnsi="Times New Roman" w:cs="Times New Roman"/>
+        </w:rPr>
+        <w:t>:</w:t>
+      </w:r>
+      <w:r>
+        <w:rPr>
+          <w:rStyle w:val="NormalTok"/>
+          <w:rFonts w:ascii="Times New Roman" w:hAnsi="Times New Roman" w:cs="Times New Roman"/>
+        </w:rPr>
+        <w:t xml:space="preserve"> </w:t>
+      </w:r>
+      <w:proofErr w:type="spellStart"/>
       <w:r>
         <w:rPr>
           <w:rStyle w:val="DataTypeTok"/>
@@ -2158,6 +2434,7 @@
         </w:rPr>
         <w:t>FilePath</w:t>
       </w:r>
+      <w:proofErr w:type="spellEnd"/>
       <w:r>
         <w:rPr>
           <w:rStyle w:val="NormalTok"/>
@@ -2225,20 +2502,30 @@
         </w:rPr>
         <w:br/>
       </w:r>
-      <w:r>
-        <w:rPr>
-          <w:rStyle w:val="OtherTok"/>
-          <w:rFonts w:ascii="Times New Roman" w:hAnsi="Times New Roman" w:cs="Times New Roman"/>
-        </w:rPr>
-        <w:t>writeReport ::</w:t>
-      </w:r>
-      <w:r>
-        <w:rPr>
-          <w:rStyle w:val="NormalTok"/>
-          <w:rFonts w:ascii="Times New Roman" w:hAnsi="Times New Roman" w:cs="Times New Roman"/>
-        </w:rPr>
-        <w:t xml:space="preserve"> </w:t>
-      </w:r>
+      <w:proofErr w:type="spellStart"/>
+      <w:r>
+        <w:rPr>
+          <w:rStyle w:val="OtherTok"/>
+          <w:rFonts w:ascii="Times New Roman" w:hAnsi="Times New Roman" w:cs="Times New Roman"/>
+        </w:rPr>
+        <w:t>writeReport</w:t>
+      </w:r>
+      <w:proofErr w:type="spellEnd"/>
+      <w:r>
+        <w:rPr>
+          <w:rStyle w:val="OtherTok"/>
+          <w:rFonts w:ascii="Times New Roman" w:hAnsi="Times New Roman" w:cs="Times New Roman"/>
+        </w:rPr>
+        <w:t xml:space="preserve"> ::</w:t>
+      </w:r>
+      <w:r>
+        <w:rPr>
+          <w:rStyle w:val="NormalTok"/>
+          <w:rFonts w:ascii="Times New Roman" w:hAnsi="Times New Roman" w:cs="Times New Roman"/>
+        </w:rPr>
+        <w:t xml:space="preserve"> </w:t>
+      </w:r>
+      <w:proofErr w:type="spellStart"/>
       <w:r>
         <w:rPr>
           <w:rStyle w:val="DataTypeTok"/>
@@ -2246,6 +2533,7 @@
         </w:rPr>
         <w:t>AnalysisResult</w:t>
       </w:r>
+      <w:proofErr w:type="spellEnd"/>
       <w:r>
         <w:rPr>
           <w:rStyle w:val="NormalTok"/>
@@ -2374,20 +2662,39 @@
         </w:rPr>
         <w:br/>
       </w:r>
-      <w:r>
-        <w:rPr>
-          <w:rStyle w:val="OtherTok"/>
-          <w:rFonts w:ascii="Times New Roman" w:hAnsi="Times New Roman" w:cs="Times New Roman"/>
-        </w:rPr>
-        <w:t>bucketTime ::</w:t>
-      </w:r>
-      <w:r>
-        <w:rPr>
-          <w:rStyle w:val="NormalTok"/>
-          <w:rFonts w:ascii="Times New Roman" w:hAnsi="Times New Roman" w:cs="Times New Roman"/>
-        </w:rPr>
-        <w:t xml:space="preserve"> </w:t>
-      </w:r>
+      <w:proofErr w:type="spellStart"/>
+      <w:proofErr w:type="gramStart"/>
+      <w:r>
+        <w:rPr>
+          <w:rStyle w:val="OtherTok"/>
+          <w:rFonts w:ascii="Times New Roman" w:hAnsi="Times New Roman" w:cs="Times New Roman"/>
+        </w:rPr>
+        <w:t>bucketTime</w:t>
+      </w:r>
+      <w:proofErr w:type="spellEnd"/>
+      <w:r>
+        <w:rPr>
+          <w:rStyle w:val="OtherTok"/>
+          <w:rFonts w:ascii="Times New Roman" w:hAnsi="Times New Roman" w:cs="Times New Roman"/>
+        </w:rPr>
+        <w:t xml:space="preserve"> :</w:t>
+      </w:r>
+      <w:proofErr w:type="gramEnd"/>
+      <w:r>
+        <w:rPr>
+          <w:rStyle w:val="OtherTok"/>
+          <w:rFonts w:ascii="Times New Roman" w:hAnsi="Times New Roman" w:cs="Times New Roman"/>
+        </w:rPr>
+        <w:t>:</w:t>
+      </w:r>
+      <w:r>
+        <w:rPr>
+          <w:rStyle w:val="NormalTok"/>
+          <w:rFonts w:ascii="Times New Roman" w:hAnsi="Times New Roman" w:cs="Times New Roman"/>
+        </w:rPr>
+        <w:t xml:space="preserve"> </w:t>
+      </w:r>
+      <w:proofErr w:type="spellStart"/>
       <w:r>
         <w:rPr>
           <w:rStyle w:val="DataTypeTok"/>
@@ -2395,6 +2702,7 @@
         </w:rPr>
         <w:t>NominalDiffTime</w:t>
       </w:r>
+      <w:proofErr w:type="spellEnd"/>
       <w:r>
         <w:rPr>
           <w:rStyle w:val="NormalTok"/>
@@ -2416,6 +2724,7 @@
         </w:rPr>
         <w:t xml:space="preserve"> </w:t>
       </w:r>
+      <w:proofErr w:type="spellStart"/>
       <w:r>
         <w:rPr>
           <w:rStyle w:val="DataTypeTok"/>
@@ -2423,6 +2732,7 @@
         </w:rPr>
         <w:t>UTCTime</w:t>
       </w:r>
+      <w:proofErr w:type="spellEnd"/>
       <w:r>
         <w:rPr>
           <w:rStyle w:val="NormalTok"/>
@@ -2444,6 +2754,7 @@
         </w:rPr>
         <w:t xml:space="preserve"> </w:t>
       </w:r>
+      <w:proofErr w:type="spellStart"/>
       <w:r>
         <w:rPr>
           <w:rStyle w:val="DataTypeTok"/>
@@ -2451,6 +2762,7 @@
         </w:rPr>
         <w:t>UTCTime</w:t>
       </w:r>
+      <w:proofErr w:type="spellEnd"/>
       <w:r>
         <w:rPr>
           <w:rFonts w:ascii="Times New Roman" w:hAnsi="Times New Roman" w:cs="Times New Roman"/>
@@ -2476,12 +2788,21 @@
         </w:rPr>
         <w:br/>
       </w:r>
-      <w:r>
-        <w:rPr>
-          <w:rStyle w:val="OtherTok"/>
-          <w:rFonts w:ascii="Times New Roman" w:hAnsi="Times New Roman" w:cs="Times New Roman"/>
-        </w:rPr>
-        <w:t>extractDomain ::</w:t>
+      <w:proofErr w:type="spellStart"/>
+      <w:r>
+        <w:rPr>
+          <w:rStyle w:val="OtherTok"/>
+          <w:rFonts w:ascii="Times New Roman" w:hAnsi="Times New Roman" w:cs="Times New Roman"/>
+        </w:rPr>
+        <w:t>extractDomain</w:t>
+      </w:r>
+      <w:proofErr w:type="spellEnd"/>
+      <w:r>
+        <w:rPr>
+          <w:rStyle w:val="OtherTok"/>
+          <w:rFonts w:ascii="Times New Roman" w:hAnsi="Times New Roman" w:cs="Times New Roman"/>
+        </w:rPr>
+        <w:t xml:space="preserve"> ::</w:t>
       </w:r>
       <w:r>
         <w:rPr>
@@ -2542,7 +2863,24 @@
           <w:rStyle w:val="CommentTok"/>
           <w:rFonts w:ascii="Times New Roman" w:hAnsi="Times New Roman" w:cs="Times New Roman"/>
         </w:rPr>
-        <w:t>-- Classify user agent into bot types</w:t>
+        <w:lastRenderedPageBreak/>
+        <w:t xml:space="preserve">-- Classify user agent into </w:t>
+      </w:r>
+      <w:proofErr w:type="spellStart"/>
+      <w:r>
+        <w:rPr>
+          <w:rStyle w:val="CommentTok"/>
+          <w:rFonts w:ascii="Times New Roman" w:hAnsi="Times New Roman" w:cs="Times New Roman"/>
+        </w:rPr>
+        <w:t>bot</w:t>
+      </w:r>
+      <w:proofErr w:type="spellEnd"/>
+      <w:r>
+        <w:rPr>
+          <w:rStyle w:val="CommentTok"/>
+          <w:rFonts w:ascii="Times New Roman" w:hAnsi="Times New Roman" w:cs="Times New Roman"/>
+        </w:rPr>
+        <w:t xml:space="preserve"> types</w:t>
       </w:r>
       <w:r>
         <w:rPr>
@@ -2550,12 +2888,21 @@
         </w:rPr>
         <w:br/>
       </w:r>
-      <w:r>
-        <w:rPr>
-          <w:rStyle w:val="OtherTok"/>
-          <w:rFonts w:ascii="Times New Roman" w:hAnsi="Times New Roman" w:cs="Times New Roman"/>
-        </w:rPr>
-        <w:t>classifyBot ::</w:t>
+      <w:proofErr w:type="spellStart"/>
+      <w:r>
+        <w:rPr>
+          <w:rStyle w:val="OtherTok"/>
+          <w:rFonts w:ascii="Times New Roman" w:hAnsi="Times New Roman" w:cs="Times New Roman"/>
+        </w:rPr>
+        <w:t>classifyBot</w:t>
+      </w:r>
+      <w:proofErr w:type="spellEnd"/>
+      <w:r>
+        <w:rPr>
+          <w:rStyle w:val="OtherTok"/>
+          <w:rFonts w:ascii="Times New Roman" w:hAnsi="Times New Roman" w:cs="Times New Roman"/>
+        </w:rPr>
+        <w:t xml:space="preserve"> ::</w:t>
       </w:r>
       <w:r>
         <w:rPr>
@@ -2592,6 +2939,7 @@
         </w:rPr>
         <w:t xml:space="preserve"> </w:t>
       </w:r>
+      <w:proofErr w:type="spellStart"/>
       <w:r>
         <w:rPr>
           <w:rStyle w:val="DataTypeTok"/>
@@ -2599,6 +2947,7 @@
         </w:rPr>
         <w:t>BotType</w:t>
       </w:r>
+      <w:proofErr w:type="spellEnd"/>
     </w:p>
     <w:p>
       <w:pPr>
@@ -2608,19 +2957,16 @@
           <w:color w:val="auto"/>
         </w:rPr>
       </w:pPr>
-      <w:bookmarkStart w:id="11" w:name="Xfbdd06b15adb2b011ee62c49e1cb08ffe6919ec"/>
-      <w:bookmarkEnd w:id="7"/>
-      <w:bookmarkEnd w:id="10"/>
+      <w:bookmarkStart w:id="12" w:name="Xfbdd06b15adb2b011ee62c49e1cb08ffe6919ec"/>
+      <w:bookmarkEnd w:id="8"/>
+      <w:bookmarkEnd w:id="11"/>
       <w:r>
         <w:rPr>
           <w:rFonts w:ascii="Times New Roman" w:hAnsi="Times New Roman" w:cs="Times New Roman"/>
           <w:color w:val="auto"/>
         </w:rPr>
-        <w:lastRenderedPageBreak/>
         <w:t>3. Functional Programming Concepts</w:t>
       </w:r>
-      <w:bookmarkStart w:id="12" w:name="_GoBack"/>
-      <w:bookmarkEnd w:id="12"/>
     </w:p>
     <w:p>
       <w:pPr>
@@ -2825,12 +3171,21 @@
         </w:rPr>
         <w:br/>
       </w:r>
-      <w:r>
-        <w:rPr>
-          <w:rStyle w:val="OtherTok"/>
-          <w:rFonts w:ascii="Times New Roman" w:hAnsi="Times New Roman" w:cs="Times New Roman"/>
-        </w:rPr>
-        <w:t>splitSessions ::</w:t>
+      <w:proofErr w:type="spellStart"/>
+      <w:r>
+        <w:rPr>
+          <w:rStyle w:val="OtherTok"/>
+          <w:rFonts w:ascii="Times New Roman" w:hAnsi="Times New Roman" w:cs="Times New Roman"/>
+        </w:rPr>
+        <w:t>splitSessions</w:t>
+      </w:r>
+      <w:proofErr w:type="spellEnd"/>
+      <w:r>
+        <w:rPr>
+          <w:rStyle w:val="OtherTok"/>
+          <w:rFonts w:ascii="Times New Roman" w:hAnsi="Times New Roman" w:cs="Times New Roman"/>
+        </w:rPr>
+        <w:t xml:space="preserve"> ::</w:t>
       </w:r>
       <w:r>
         <w:rPr>
@@ -2839,6 +3194,7 @@
         </w:rPr>
         <w:t xml:space="preserve"> [</w:t>
       </w:r>
+      <w:proofErr w:type="spellStart"/>
       <w:r>
         <w:rPr>
           <w:rStyle w:val="DataTypeTok"/>
@@ -2846,6 +3202,7 @@
         </w:rPr>
         <w:t>LogEntry</w:t>
       </w:r>
+      <w:proofErr w:type="spellEnd"/>
       <w:r>
         <w:rPr>
           <w:rStyle w:val="NormalTok"/>
@@ -2867,6 +3224,7 @@
         </w:rPr>
         <w:t xml:space="preserve"> [[</w:t>
       </w:r>
+      <w:proofErr w:type="spellStart"/>
       <w:r>
         <w:rPr>
           <w:rStyle w:val="DataTypeTok"/>
@@ -2874,6 +3232,7 @@
         </w:rPr>
         <w:t>LogEntry</w:t>
       </w:r>
+      <w:proofErr w:type="spellEnd"/>
       <w:r>
         <w:rPr>
           <w:rStyle w:val="NormalTok"/>
@@ -2887,12 +3246,21 @@
         </w:rPr>
         <w:br/>
       </w:r>
-      <w:r>
-        <w:rPr>
-          <w:rStyle w:val="NormalTok"/>
-          <w:rFonts w:ascii="Times New Roman" w:hAnsi="Times New Roman" w:cs="Times New Roman"/>
-        </w:rPr>
-        <w:t xml:space="preserve">splitSessions [] </w:t>
+      <w:proofErr w:type="spellStart"/>
+      <w:r>
+        <w:rPr>
+          <w:rStyle w:val="NormalTok"/>
+          <w:rFonts w:ascii="Times New Roman" w:hAnsi="Times New Roman" w:cs="Times New Roman"/>
+        </w:rPr>
+        <w:t>splitSessions</w:t>
+      </w:r>
+      <w:proofErr w:type="spellEnd"/>
+      <w:r>
+        <w:rPr>
+          <w:rStyle w:val="NormalTok"/>
+          <w:rFonts w:ascii="Times New Roman" w:hAnsi="Times New Roman" w:cs="Times New Roman"/>
+        </w:rPr>
+        <w:t xml:space="preserve"> [] </w:t>
       </w:r>
       <w:r>
         <w:rPr>
@@ -2914,12 +3282,29 @@
         </w:rPr>
         <w:br/>
       </w:r>
-      <w:r>
-        <w:rPr>
-          <w:rStyle w:val="NormalTok"/>
-          <w:rFonts w:ascii="Times New Roman" w:hAnsi="Times New Roman" w:cs="Times New Roman"/>
-        </w:rPr>
-        <w:t>splitSessions (x</w:t>
+      <w:proofErr w:type="spellStart"/>
+      <w:r>
+        <w:rPr>
+          <w:rStyle w:val="NormalTok"/>
+          <w:rFonts w:ascii="Times New Roman" w:hAnsi="Times New Roman" w:cs="Times New Roman"/>
+        </w:rPr>
+        <w:t>splitSessions</w:t>
+      </w:r>
+      <w:proofErr w:type="spellEnd"/>
+      <w:r>
+        <w:rPr>
+          <w:rStyle w:val="NormalTok"/>
+          <w:rFonts w:ascii="Times New Roman" w:hAnsi="Times New Roman" w:cs="Times New Roman"/>
+        </w:rPr>
+        <w:t xml:space="preserve"> (</w:t>
+      </w:r>
+      <w:proofErr w:type="spellStart"/>
+      <w:r>
+        <w:rPr>
+          <w:rStyle w:val="NormalTok"/>
+          <w:rFonts w:ascii="Times New Roman" w:hAnsi="Times New Roman" w:cs="Times New Roman"/>
+        </w:rPr>
+        <w:t>x</w:t>
       </w:r>
       <w:r>
         <w:rPr>
@@ -2933,7 +3318,15 @@
           <w:rStyle w:val="NormalTok"/>
           <w:rFonts w:ascii="Times New Roman" w:hAnsi="Times New Roman" w:cs="Times New Roman"/>
         </w:rPr>
-        <w:t xml:space="preserve">xs) </w:t>
+        <w:t>xs</w:t>
+      </w:r>
+      <w:proofErr w:type="spellEnd"/>
+      <w:r>
+        <w:rPr>
+          <w:rStyle w:val="NormalTok"/>
+          <w:rFonts w:ascii="Times New Roman" w:hAnsi="Times New Roman" w:cs="Times New Roman"/>
+        </w:rPr>
+        <w:t xml:space="preserve">) </w:t>
       </w:r>
       <w:r>
         <w:rPr>
@@ -2947,8 +3340,17 @@
           <w:rStyle w:val="NormalTok"/>
           <w:rFonts w:ascii="Times New Roman" w:hAnsi="Times New Roman" w:cs="Times New Roman"/>
         </w:rPr>
-        <w:t xml:space="preserve"> go [x] xs</w:t>
-      </w:r>
+        <w:t xml:space="preserve"> go [x] </w:t>
+      </w:r>
+      <w:proofErr w:type="spellStart"/>
+      <w:r>
+        <w:rPr>
+          <w:rStyle w:val="NormalTok"/>
+          <w:rFonts w:ascii="Times New Roman" w:hAnsi="Times New Roman" w:cs="Times New Roman"/>
+        </w:rPr>
+        <w:t>xs</w:t>
+      </w:r>
+      <w:proofErr w:type="spellEnd"/>
       <w:r>
         <w:rPr>
           <w:rFonts w:ascii="Times New Roman" w:hAnsi="Times New Roman" w:cs="Times New Roman"/>
@@ -2980,7 +3382,23 @@
           <w:rStyle w:val="NormalTok"/>
           <w:rFonts w:ascii="Times New Roman" w:hAnsi="Times New Roman" w:cs="Times New Roman"/>
         </w:rPr>
-        <w:t xml:space="preserve">    go currentSession [] </w:t>
+        <w:t xml:space="preserve">    go </w:t>
+      </w:r>
+      <w:proofErr w:type="spellStart"/>
+      <w:r>
+        <w:rPr>
+          <w:rStyle w:val="NormalTok"/>
+          <w:rFonts w:ascii="Times New Roman" w:hAnsi="Times New Roman" w:cs="Times New Roman"/>
+        </w:rPr>
+        <w:t>currentSession</w:t>
+      </w:r>
+      <w:proofErr w:type="spellEnd"/>
+      <w:r>
+        <w:rPr>
+          <w:rStyle w:val="NormalTok"/>
+          <w:rFonts w:ascii="Times New Roman" w:hAnsi="Times New Roman" w:cs="Times New Roman"/>
+        </w:rPr>
+        <w:t xml:space="preserve"> [] </w:t>
       </w:r>
       <w:r>
         <w:rPr>
@@ -3008,7 +3426,23 @@
           <w:rStyle w:val="NormalTok"/>
           <w:rFonts w:ascii="Times New Roman" w:hAnsi="Times New Roman" w:cs="Times New Roman"/>
         </w:rPr>
-        <w:t xml:space="preserve"> currentSession]</w:t>
+        <w:t xml:space="preserve"> </w:t>
+      </w:r>
+      <w:proofErr w:type="spellStart"/>
+      <w:r>
+        <w:rPr>
+          <w:rStyle w:val="NormalTok"/>
+          <w:rFonts w:ascii="Times New Roman" w:hAnsi="Times New Roman" w:cs="Times New Roman"/>
+        </w:rPr>
+        <w:t>currentSession</w:t>
+      </w:r>
+      <w:proofErr w:type="spellEnd"/>
+      <w:r>
+        <w:rPr>
+          <w:rStyle w:val="NormalTok"/>
+          <w:rFonts w:ascii="Times New Roman" w:hAnsi="Times New Roman" w:cs="Times New Roman"/>
+        </w:rPr>
+        <w:t>]</w:t>
       </w:r>
       <w:r>
         <w:rPr>
@@ -3021,8 +3455,17 @@
           <w:rStyle w:val="NormalTok"/>
           <w:rFonts w:ascii="Times New Roman" w:hAnsi="Times New Roman" w:cs="Times New Roman"/>
         </w:rPr>
-        <w:t xml:space="preserve">    go currentSession</w:t>
-      </w:r>
+        <w:t xml:space="preserve">    go </w:t>
+      </w:r>
+      <w:proofErr w:type="spellStart"/>
+      <w:r>
+        <w:rPr>
+          <w:rStyle w:val="NormalTok"/>
+          <w:rFonts w:ascii="Times New Roman" w:hAnsi="Times New Roman" w:cs="Times New Roman"/>
+        </w:rPr>
+        <w:t>currentSession</w:t>
+      </w:r>
+      <w:proofErr w:type="spellEnd"/>
       <w:r>
         <w:rPr>
           <w:rStyle w:val="OperatorTok"/>
@@ -3049,7 +3492,15 @@
           <w:rStyle w:val="NormalTok"/>
           <w:rFonts w:ascii="Times New Roman" w:hAnsi="Times New Roman" w:cs="Times New Roman"/>
         </w:rPr>
-        <w:t>_) (next</w:t>
+        <w:t>_) (</w:t>
+      </w:r>
+      <w:proofErr w:type="spellStart"/>
+      <w:r>
+        <w:rPr>
+          <w:rStyle w:val="NormalTok"/>
+          <w:rFonts w:ascii="Times New Roman" w:hAnsi="Times New Roman" w:cs="Times New Roman"/>
+        </w:rPr>
+        <w:t>next</w:t>
       </w:r>
       <w:r>
         <w:rPr>
@@ -3063,7 +3514,15 @@
           <w:rStyle w:val="NormalTok"/>
           <w:rFonts w:ascii="Times New Roman" w:hAnsi="Times New Roman" w:cs="Times New Roman"/>
         </w:rPr>
-        <w:t>rest)</w:t>
+        <w:t>rest</w:t>
+      </w:r>
+      <w:proofErr w:type="spellEnd"/>
+      <w:r>
+        <w:rPr>
+          <w:rStyle w:val="NormalTok"/>
+          <w:rFonts w:ascii="Times New Roman" w:hAnsi="Times New Roman" w:cs="Times New Roman"/>
+        </w:rPr>
+        <w:t>)</w:t>
       </w:r>
       <w:r>
         <w:rPr>
@@ -3132,7 +3591,23 @@
           <w:rStyle w:val="NormalTok"/>
           <w:rFonts w:ascii="Times New Roman" w:hAnsi="Times New Roman" w:cs="Times New Roman"/>
         </w:rPr>
-        <w:t xml:space="preserve"> currentSession </w:t>
+        <w:t xml:space="preserve"> </w:t>
+      </w:r>
+      <w:proofErr w:type="spellStart"/>
+      <w:r>
+        <w:rPr>
+          <w:rStyle w:val="NormalTok"/>
+          <w:rFonts w:ascii="Times New Roman" w:hAnsi="Times New Roman" w:cs="Times New Roman"/>
+        </w:rPr>
+        <w:t>currentSession</w:t>
+      </w:r>
+      <w:proofErr w:type="spellEnd"/>
+      <w:r>
+        <w:rPr>
+          <w:rStyle w:val="NormalTok"/>
+          <w:rFonts w:ascii="Times New Roman" w:hAnsi="Times New Roman" w:cs="Times New Roman"/>
+        </w:rPr>
+        <w:t xml:space="preserve"> </w:t>
       </w:r>
       <w:r>
         <w:rPr>
@@ -3201,7 +3676,15 @@
           <w:rStyle w:val="NormalTok"/>
           <w:rFonts w:ascii="Times New Roman" w:hAnsi="Times New Roman" w:cs="Times New Roman"/>
         </w:rPr>
-        <w:t xml:space="preserve"> go (next</w:t>
+        <w:t xml:space="preserve"> go (</w:t>
+      </w:r>
+      <w:proofErr w:type="spellStart"/>
+      <w:r>
+        <w:rPr>
+          <w:rStyle w:val="NormalTok"/>
+          <w:rFonts w:ascii="Times New Roman" w:hAnsi="Times New Roman" w:cs="Times New Roman"/>
+        </w:rPr>
+        <w:t>next</w:t>
       </w:r>
       <w:r>
         <w:rPr>
@@ -3215,7 +3698,15 @@
           <w:rStyle w:val="NormalTok"/>
           <w:rFonts w:ascii="Times New Roman" w:hAnsi="Times New Roman" w:cs="Times New Roman"/>
         </w:rPr>
-        <w:t>currentSession) rest</w:t>
+        <w:t>currentSession</w:t>
+      </w:r>
+      <w:proofErr w:type="spellEnd"/>
+      <w:r>
+        <w:rPr>
+          <w:rStyle w:val="NormalTok"/>
+          <w:rFonts w:ascii="Times New Roman" w:hAnsi="Times New Roman" w:cs="Times New Roman"/>
+        </w:rPr>
+        <w:t>) rest</w:t>
       </w:r>
       <w:r>
         <w:rPr>
@@ -3262,7 +3753,55 @@
           <w:rStyle w:val="NormalTok"/>
           <w:rFonts w:ascii="Times New Roman" w:hAnsi="Times New Roman" w:cs="Times New Roman"/>
         </w:rPr>
-        <w:t xml:space="preserve"> diffUTCTime (leTimestamp next) (leTimestamp latest)</w:t>
+        <w:t xml:space="preserve"> </w:t>
+      </w:r>
+      <w:proofErr w:type="spellStart"/>
+      <w:r>
+        <w:rPr>
+          <w:rStyle w:val="NormalTok"/>
+          <w:rFonts w:ascii="Times New Roman" w:hAnsi="Times New Roman" w:cs="Times New Roman"/>
+        </w:rPr>
+        <w:t>diffUTCTime</w:t>
+      </w:r>
+      <w:proofErr w:type="spellEnd"/>
+      <w:r>
+        <w:rPr>
+          <w:rStyle w:val="NormalTok"/>
+          <w:rFonts w:ascii="Times New Roman" w:hAnsi="Times New Roman" w:cs="Times New Roman"/>
+        </w:rPr>
+        <w:t xml:space="preserve"> (</w:t>
+      </w:r>
+      <w:proofErr w:type="spellStart"/>
+      <w:r>
+        <w:rPr>
+          <w:rStyle w:val="NormalTok"/>
+          <w:rFonts w:ascii="Times New Roman" w:hAnsi="Times New Roman" w:cs="Times New Roman"/>
+        </w:rPr>
+        <w:t>leTimestamp</w:t>
+      </w:r>
+      <w:proofErr w:type="spellEnd"/>
+      <w:r>
+        <w:rPr>
+          <w:rStyle w:val="NormalTok"/>
+          <w:rFonts w:ascii="Times New Roman" w:hAnsi="Times New Roman" w:cs="Times New Roman"/>
+        </w:rPr>
+        <w:t xml:space="preserve"> next) (</w:t>
+      </w:r>
+      <w:proofErr w:type="spellStart"/>
+      <w:r>
+        <w:rPr>
+          <w:rStyle w:val="NormalTok"/>
+          <w:rFonts w:ascii="Times New Roman" w:hAnsi="Times New Roman" w:cs="Times New Roman"/>
+        </w:rPr>
+        <w:t>leTimestamp</w:t>
+      </w:r>
+      <w:proofErr w:type="spellEnd"/>
+      <w:r>
+        <w:rPr>
+          <w:rStyle w:val="NormalTok"/>
+          <w:rFonts w:ascii="Times New Roman" w:hAnsi="Times New Roman" w:cs="Times New Roman"/>
+        </w:rPr>
+        <w:t xml:space="preserve"> latest)</w:t>
       </w:r>
     </w:p>
     <w:p>
@@ -3343,12 +3882,30 @@
         </w:rPr>
         <w:br/>
       </w:r>
-      <w:r>
-        <w:rPr>
-          <w:rStyle w:val="OtherTok"/>
-          <w:rFonts w:ascii="Times New Roman" w:hAnsi="Times New Roman" w:cs="Times New Roman"/>
-        </w:rPr>
-        <w:t>requestsPerEndpoint ::</w:t>
+      <w:proofErr w:type="spellStart"/>
+      <w:proofErr w:type="gramStart"/>
+      <w:r>
+        <w:rPr>
+          <w:rStyle w:val="OtherTok"/>
+          <w:rFonts w:ascii="Times New Roman" w:hAnsi="Times New Roman" w:cs="Times New Roman"/>
+        </w:rPr>
+        <w:t>requestsPerEndpoint</w:t>
+      </w:r>
+      <w:proofErr w:type="spellEnd"/>
+      <w:r>
+        <w:rPr>
+          <w:rStyle w:val="OtherTok"/>
+          <w:rFonts w:ascii="Times New Roman" w:hAnsi="Times New Roman" w:cs="Times New Roman"/>
+        </w:rPr>
+        <w:t xml:space="preserve"> :</w:t>
+      </w:r>
+      <w:proofErr w:type="gramEnd"/>
+      <w:r>
+        <w:rPr>
+          <w:rStyle w:val="OtherTok"/>
+          <w:rFonts w:ascii="Times New Roman" w:hAnsi="Times New Roman" w:cs="Times New Roman"/>
+        </w:rPr>
+        <w:t>:</w:t>
       </w:r>
       <w:r>
         <w:rPr>
@@ -3357,6 +3914,7 @@
         </w:rPr>
         <w:t xml:space="preserve"> (</w:t>
       </w:r>
+      <w:proofErr w:type="spellStart"/>
       <w:r>
         <w:rPr>
           <w:rStyle w:val="DataTypeTok"/>
@@ -3364,6 +3922,7 @@
         </w:rPr>
         <w:t>LogEntry</w:t>
       </w:r>
+      <w:proofErr w:type="spellEnd"/>
       <w:r>
         <w:rPr>
           <w:rStyle w:val="NormalTok"/>
@@ -3427,6 +3986,7 @@
         </w:rPr>
         <w:t xml:space="preserve"> [</w:t>
       </w:r>
+      <w:proofErr w:type="spellStart"/>
       <w:r>
         <w:rPr>
           <w:rStyle w:val="DataTypeTok"/>
@@ -3434,6 +3994,7 @@
         </w:rPr>
         <w:t>LogEntry</w:t>
       </w:r>
+      <w:proofErr w:type="spellEnd"/>
       <w:r>
         <w:rPr>
           <w:rStyle w:val="NormalTok"/>
@@ -3496,12 +4057,21 @@
         </w:rPr>
         <w:br/>
       </w:r>
-      <w:r>
-        <w:rPr>
-          <w:rStyle w:val="NormalTok"/>
-          <w:rFonts w:ascii="Times New Roman" w:hAnsi="Times New Roman" w:cs="Times New Roman"/>
-        </w:rPr>
-        <w:t xml:space="preserve">requestsPerEndpoint extractor </w:t>
+      <w:proofErr w:type="spellStart"/>
+      <w:r>
+        <w:rPr>
+          <w:rStyle w:val="NormalTok"/>
+          <w:rFonts w:ascii="Times New Roman" w:hAnsi="Times New Roman" w:cs="Times New Roman"/>
+        </w:rPr>
+        <w:t>requestsPerEndpoint</w:t>
+      </w:r>
+      <w:proofErr w:type="spellEnd"/>
+      <w:r>
+        <w:rPr>
+          <w:rStyle w:val="NormalTok"/>
+          <w:rFonts w:ascii="Times New Roman" w:hAnsi="Times New Roman" w:cs="Times New Roman"/>
+        </w:rPr>
+        <w:t xml:space="preserve"> extractor </w:t>
       </w:r>
       <w:r>
         <w:rPr>
@@ -3515,8 +4085,33 @@
           <w:rStyle w:val="NormalTok"/>
           <w:rFonts w:ascii="Times New Roman" w:hAnsi="Times New Roman" w:cs="Times New Roman"/>
         </w:rPr>
-        <w:t xml:space="preserve"> foldl' aggregate M.empty</w:t>
-      </w:r>
+        <w:t xml:space="preserve"> </w:t>
+      </w:r>
+      <w:proofErr w:type="spellStart"/>
+      <w:r>
+        <w:rPr>
+          <w:rStyle w:val="NormalTok"/>
+          <w:rFonts w:ascii="Times New Roman" w:hAnsi="Times New Roman" w:cs="Times New Roman"/>
+        </w:rPr>
+        <w:t>foldl</w:t>
+      </w:r>
+      <w:proofErr w:type="spellEnd"/>
+      <w:r>
+        <w:rPr>
+          <w:rStyle w:val="NormalTok"/>
+          <w:rFonts w:ascii="Times New Roman" w:hAnsi="Times New Roman" w:cs="Times New Roman"/>
+        </w:rPr>
+        <w:t xml:space="preserve">' aggregate </w:t>
+      </w:r>
+      <w:proofErr w:type="spellStart"/>
+      <w:r>
+        <w:rPr>
+          <w:rStyle w:val="NormalTok"/>
+          <w:rFonts w:ascii="Times New Roman" w:hAnsi="Times New Roman" w:cs="Times New Roman"/>
+        </w:rPr>
+        <w:t>M.empty</w:t>
+      </w:r>
+      <w:proofErr w:type="spellEnd"/>
       <w:r>
         <w:rPr>
           <w:rFonts w:ascii="Times New Roman" w:hAnsi="Times New Roman" w:cs="Times New Roman"/>
@@ -3624,7 +4219,23 @@
           <w:rStyle w:val="NormalTok"/>
           <w:rFonts w:ascii="Times New Roman" w:hAnsi="Times New Roman" w:cs="Times New Roman"/>
         </w:rPr>
-        <w:t xml:space="preserve"> M.insertWith (</w:t>
+        <w:t xml:space="preserve"> </w:t>
+      </w:r>
+      <w:proofErr w:type="spellStart"/>
+      <w:r>
+        <w:rPr>
+          <w:rStyle w:val="NormalTok"/>
+          <w:rFonts w:ascii="Times New Roman" w:hAnsi="Times New Roman" w:cs="Times New Roman"/>
+        </w:rPr>
+        <w:t>M.insertWith</w:t>
+      </w:r>
+      <w:proofErr w:type="spellEnd"/>
+      <w:r>
+        <w:rPr>
+          <w:rStyle w:val="NormalTok"/>
+          <w:rFonts w:ascii="Times New Roman" w:hAnsi="Times New Roman" w:cs="Times New Roman"/>
+        </w:rPr>
+        <w:t xml:space="preserve"> (</w:t>
       </w:r>
       <w:r>
         <w:rPr>
@@ -3746,7 +4357,23 @@
           <w:rStyle w:val="VerbatimChar"/>
           <w:rFonts w:ascii="Times New Roman" w:hAnsi="Times New Roman" w:cs="Times New Roman"/>
         </w:rPr>
-        <w:t>map parseLogLine lines</w:t>
+        <w:t xml:space="preserve">map </w:t>
+      </w:r>
+      <w:proofErr w:type="spellStart"/>
+      <w:r>
+        <w:rPr>
+          <w:rStyle w:val="VerbatimChar"/>
+          <w:rFonts w:ascii="Times New Roman" w:hAnsi="Times New Roman" w:cs="Times New Roman"/>
+        </w:rPr>
+        <w:t>parseLogLine</w:t>
+      </w:r>
+      <w:proofErr w:type="spellEnd"/>
+      <w:r>
+        <w:rPr>
+          <w:rStyle w:val="VerbatimChar"/>
+          <w:rFonts w:ascii="Times New Roman" w:hAnsi="Times New Roman" w:cs="Times New Roman"/>
+        </w:rPr>
+        <w:t xml:space="preserve"> lines</w:t>
       </w:r>
       <w:r>
         <w:rPr>
@@ -3780,14 +4407,55 @@
           <w:rStyle w:val="VerbatimChar"/>
           <w:rFonts w:ascii="Times New Roman" w:hAnsi="Times New Roman" w:cs="Times New Roman"/>
         </w:rPr>
-        <w:t>filter (isError . leStatusCode)</w:t>
-      </w:r>
-      <w:r>
-        <w:rPr>
+        <w:t>filter (</w:t>
+      </w:r>
+      <w:proofErr w:type="spellStart"/>
+      <w:proofErr w:type="gramStart"/>
+      <w:r>
+        <w:rPr>
+          <w:rStyle w:val="VerbatimChar"/>
+          <w:rFonts w:ascii="Times New Roman" w:hAnsi="Times New Roman" w:cs="Times New Roman"/>
+        </w:rPr>
+        <w:t>isError</w:t>
+      </w:r>
+      <w:proofErr w:type="spellEnd"/>
+      <w:r>
+        <w:rPr>
+          <w:rStyle w:val="VerbatimChar"/>
+          <w:rFonts w:ascii="Times New Roman" w:hAnsi="Times New Roman" w:cs="Times New Roman"/>
+        </w:rPr>
+        <w:t xml:space="preserve"> .</w:t>
+      </w:r>
+      <w:proofErr w:type="gramEnd"/>
+      <w:r>
+        <w:rPr>
+          <w:rStyle w:val="VerbatimChar"/>
+          <w:rFonts w:ascii="Times New Roman" w:hAnsi="Times New Roman" w:cs="Times New Roman"/>
+        </w:rPr>
+        <w:t xml:space="preserve"> </w:t>
+      </w:r>
+      <w:proofErr w:type="spellStart"/>
+      <w:r>
+        <w:rPr>
+          <w:rStyle w:val="VerbatimChar"/>
+          <w:rFonts w:ascii="Times New Roman" w:hAnsi="Times New Roman" w:cs="Times New Roman"/>
+        </w:rPr>
+        <w:t>leStatusCode</w:t>
+      </w:r>
+      <w:proofErr w:type="spellEnd"/>
+      <w:r>
+        <w:rPr>
+          <w:rStyle w:val="VerbatimChar"/>
           <w:rFonts w:ascii="Times New Roman" w:hAnsi="Times New Roman" w:cs="Times New Roman"/>
         </w:rPr>
         <w:t>)</w:t>
       </w:r>
+      <w:r>
+        <w:rPr>
+          <w:rFonts w:ascii="Times New Roman" w:hAnsi="Times New Roman" w:cs="Times New Roman"/>
+        </w:rPr>
+        <w:t>)</w:t>
+      </w:r>
     </w:p>
     <w:p>
       <w:pPr>
@@ -3796,12 +4464,22 @@
           <w:rFonts w:ascii="Times New Roman" w:hAnsi="Times New Roman" w:cs="Times New Roman"/>
         </w:rPr>
       </w:pPr>
+      <w:proofErr w:type="spellStart"/>
       <w:r>
         <w:rPr>
           <w:rStyle w:val="VerbatimChar"/>
           <w:rFonts w:ascii="Times New Roman" w:hAnsi="Times New Roman" w:cs="Times New Roman"/>
         </w:rPr>
-        <w:t>foldl'</w:t>
+        <w:lastRenderedPageBreak/>
+        <w:t>foldl</w:t>
+      </w:r>
+      <w:proofErr w:type="spellEnd"/>
+      <w:r>
+        <w:rPr>
+          <w:rStyle w:val="VerbatimChar"/>
+          <w:rFonts w:ascii="Times New Roman" w:hAnsi="Times New Roman" w:cs="Times New Roman"/>
+        </w:rPr>
+        <w:t>'</w:t>
       </w:r>
       <w:r>
         <w:rPr>
@@ -3817,27 +4495,46 @@
           <w:rFonts w:ascii="Times New Roman" w:hAnsi="Times New Roman" w:cs="Times New Roman"/>
         </w:rPr>
       </w:pPr>
+      <w:proofErr w:type="spellStart"/>
       <w:r>
         <w:rPr>
           <w:rStyle w:val="VerbatimChar"/>
           <w:rFonts w:ascii="Times New Roman" w:hAnsi="Times New Roman" w:cs="Times New Roman"/>
         </w:rPr>
-        <w:lastRenderedPageBreak/>
         <w:t>sortOn</w:t>
       </w:r>
+      <w:proofErr w:type="spellEnd"/>
       <w:r>
         <w:rPr>
           <w:rFonts w:ascii="Times New Roman" w:hAnsi="Times New Roman" w:cs="Times New Roman"/>
         </w:rPr>
         <w:t xml:space="preserve">: Sort by extracted key (e.g., </w:t>
       </w:r>
+      <w:proofErr w:type="spellStart"/>
       <w:r>
         <w:rPr>
           <w:rStyle w:val="VerbatimChar"/>
           <w:rFonts w:ascii="Times New Roman" w:hAnsi="Times New Roman" w:cs="Times New Roman"/>
         </w:rPr>
-        <w:t>sortOn leTimestamp</w:t>
-      </w:r>
+        <w:t>sortOn</w:t>
+      </w:r>
+      <w:proofErr w:type="spellEnd"/>
+      <w:r>
+        <w:rPr>
+          <w:rStyle w:val="VerbatimChar"/>
+          <w:rFonts w:ascii="Times New Roman" w:hAnsi="Times New Roman" w:cs="Times New Roman"/>
+        </w:rPr>
+        <w:t xml:space="preserve"> </w:t>
+      </w:r>
+      <w:proofErr w:type="spellStart"/>
+      <w:r>
+        <w:rPr>
+          <w:rStyle w:val="VerbatimChar"/>
+          <w:rFonts w:ascii="Times New Roman" w:hAnsi="Times New Roman" w:cs="Times New Roman"/>
+        </w:rPr>
+        <w:t>leTimestamp</w:t>
+      </w:r>
+      <w:proofErr w:type="spellEnd"/>
       <w:r>
         <w:rPr>
           <w:rFonts w:ascii="Times New Roman" w:hAnsi="Times New Roman" w:cs="Times New Roman"/>
@@ -3910,12 +4607,30 @@
           <w:rFonts w:ascii="Times New Roman" w:hAnsi="Times New Roman" w:cs="Times New Roman"/>
         </w:rPr>
       </w:pPr>
-      <w:r>
-        <w:rPr>
-          <w:rStyle w:val="OtherTok"/>
-          <w:rFonts w:ascii="Times New Roman" w:hAnsi="Times New Roman" w:cs="Times New Roman"/>
-        </w:rPr>
-        <w:t>parseLogFile ::</w:t>
+      <w:proofErr w:type="spellStart"/>
+      <w:proofErr w:type="gramStart"/>
+      <w:r>
+        <w:rPr>
+          <w:rStyle w:val="OtherTok"/>
+          <w:rFonts w:ascii="Times New Roman" w:hAnsi="Times New Roman" w:cs="Times New Roman"/>
+        </w:rPr>
+        <w:t>parseLogFile</w:t>
+      </w:r>
+      <w:proofErr w:type="spellEnd"/>
+      <w:r>
+        <w:rPr>
+          <w:rStyle w:val="OtherTok"/>
+          <w:rFonts w:ascii="Times New Roman" w:hAnsi="Times New Roman" w:cs="Times New Roman"/>
+        </w:rPr>
+        <w:t xml:space="preserve"> :</w:t>
+      </w:r>
+      <w:proofErr w:type="gramEnd"/>
+      <w:r>
+        <w:rPr>
+          <w:rStyle w:val="OtherTok"/>
+          <w:rFonts w:ascii="Times New Roman" w:hAnsi="Times New Roman" w:cs="Times New Roman"/>
+        </w:rPr>
+        <w:t>:</w:t>
       </w:r>
       <w:r>
         <w:rPr>
@@ -3952,6 +4667,7 @@
         </w:rPr>
         <w:t xml:space="preserve"> [</w:t>
       </w:r>
+      <w:proofErr w:type="spellStart"/>
       <w:r>
         <w:rPr>
           <w:rStyle w:val="DataTypeTok"/>
@@ -3959,6 +4675,7 @@
         </w:rPr>
         <w:t>LogEntry</w:t>
       </w:r>
+      <w:proofErr w:type="spellEnd"/>
       <w:r>
         <w:rPr>
           <w:rStyle w:val="NormalTok"/>
@@ -3972,12 +4689,21 @@
         </w:rPr>
         <w:br/>
       </w:r>
-      <w:r>
-        <w:rPr>
-          <w:rStyle w:val="NormalTok"/>
-          <w:rFonts w:ascii="Times New Roman" w:hAnsi="Times New Roman" w:cs="Times New Roman"/>
-        </w:rPr>
-        <w:t xml:space="preserve">parseLogFile content </w:t>
+      <w:proofErr w:type="spellStart"/>
+      <w:r>
+        <w:rPr>
+          <w:rStyle w:val="NormalTok"/>
+          <w:rFonts w:ascii="Times New Roman" w:hAnsi="Times New Roman" w:cs="Times New Roman"/>
+        </w:rPr>
+        <w:t>parseLogFile</w:t>
+      </w:r>
+      <w:proofErr w:type="spellEnd"/>
+      <w:r>
+        <w:rPr>
+          <w:rStyle w:val="NormalTok"/>
+          <w:rFonts w:ascii="Times New Roman" w:hAnsi="Times New Roman" w:cs="Times New Roman"/>
+        </w:rPr>
+        <w:t xml:space="preserve"> content </w:t>
       </w:r>
       <w:r>
         <w:rPr>
@@ -4060,7 +4786,23 @@
           <w:rStyle w:val="NormalTok"/>
           <w:rFonts w:ascii="Times New Roman" w:hAnsi="Times New Roman" w:cs="Times New Roman"/>
         </w:rPr>
-        <w:t xml:space="preserve"> parseLogLine (</w:t>
+        <w:t xml:space="preserve"> </w:t>
+      </w:r>
+      <w:proofErr w:type="spellStart"/>
+      <w:r>
+        <w:rPr>
+          <w:rStyle w:val="NormalTok"/>
+          <w:rFonts w:ascii="Times New Roman" w:hAnsi="Times New Roman" w:cs="Times New Roman"/>
+        </w:rPr>
+        <w:t>parseLogLine</w:t>
+      </w:r>
+      <w:proofErr w:type="spellEnd"/>
+      <w:r>
+        <w:rPr>
+          <w:rStyle w:val="NormalTok"/>
+          <w:rFonts w:ascii="Times New Roman" w:hAnsi="Times New Roman" w:cs="Times New Roman"/>
+        </w:rPr>
+        <w:t xml:space="preserve"> (</w:t>
       </w:r>
       <w:r>
         <w:rPr>
@@ -4156,12 +4898,30 @@
           <w:rFonts w:ascii="Times New Roman" w:hAnsi="Times New Roman" w:cs="Times New Roman"/>
         </w:rPr>
       </w:pPr>
-      <w:r>
-        <w:rPr>
-          <w:rStyle w:val="OtherTok"/>
-          <w:rFonts w:ascii="Times New Roman" w:hAnsi="Times New Roman" w:cs="Times New Roman"/>
-        </w:rPr>
-        <w:t>countByLevel ::</w:t>
+      <w:proofErr w:type="spellStart"/>
+      <w:proofErr w:type="gramStart"/>
+      <w:r>
+        <w:rPr>
+          <w:rStyle w:val="OtherTok"/>
+          <w:rFonts w:ascii="Times New Roman" w:hAnsi="Times New Roman" w:cs="Times New Roman"/>
+        </w:rPr>
+        <w:t>countByLevel</w:t>
+      </w:r>
+      <w:proofErr w:type="spellEnd"/>
+      <w:r>
+        <w:rPr>
+          <w:rStyle w:val="OtherTok"/>
+          <w:rFonts w:ascii="Times New Roman" w:hAnsi="Times New Roman" w:cs="Times New Roman"/>
+        </w:rPr>
+        <w:t xml:space="preserve"> :</w:t>
+      </w:r>
+      <w:proofErr w:type="gramEnd"/>
+      <w:r>
+        <w:rPr>
+          <w:rStyle w:val="OtherTok"/>
+          <w:rFonts w:ascii="Times New Roman" w:hAnsi="Times New Roman" w:cs="Times New Roman"/>
+        </w:rPr>
+        <w:t>:</w:t>
       </w:r>
       <w:r>
         <w:rPr>
@@ -4170,6 +4930,7 @@
         </w:rPr>
         <w:t xml:space="preserve"> [</w:t>
       </w:r>
+      <w:proofErr w:type="spellStart"/>
       <w:r>
         <w:rPr>
           <w:rStyle w:val="DataTypeTok"/>
@@ -4177,6 +4938,7 @@
         </w:rPr>
         <w:t>LogEntry</w:t>
       </w:r>
+      <w:proofErr w:type="spellEnd"/>
       <w:r>
         <w:rPr>
           <w:rStyle w:val="NormalTok"/>
@@ -4212,6 +4974,7 @@
         </w:rPr>
         <w:t xml:space="preserve"> </w:t>
       </w:r>
+      <w:proofErr w:type="spellStart"/>
       <w:r>
         <w:rPr>
           <w:rStyle w:val="DataTypeTok"/>
@@ -4219,6 +4982,7 @@
         </w:rPr>
         <w:t>StatusCategory</w:t>
       </w:r>
+      <w:proofErr w:type="spellEnd"/>
       <w:r>
         <w:rPr>
           <w:rStyle w:val="NormalTok"/>
@@ -4239,12 +5003,21 @@
         </w:rPr>
         <w:br/>
       </w:r>
-      <w:r>
-        <w:rPr>
-          <w:rStyle w:val="NormalTok"/>
-          <w:rFonts w:ascii="Times New Roman" w:hAnsi="Times New Roman" w:cs="Times New Roman"/>
-        </w:rPr>
-        <w:t xml:space="preserve">countByLevel </w:t>
+      <w:proofErr w:type="spellStart"/>
+      <w:r>
+        <w:rPr>
+          <w:rStyle w:val="NormalTok"/>
+          <w:rFonts w:ascii="Times New Roman" w:hAnsi="Times New Roman" w:cs="Times New Roman"/>
+        </w:rPr>
+        <w:t>countByLevel</w:t>
+      </w:r>
+      <w:proofErr w:type="spellEnd"/>
+      <w:r>
+        <w:rPr>
+          <w:rStyle w:val="NormalTok"/>
+          <w:rFonts w:ascii="Times New Roman" w:hAnsi="Times New Roman" w:cs="Times New Roman"/>
+        </w:rPr>
+        <w:t xml:space="preserve"> </w:t>
       </w:r>
       <w:r>
         <w:rPr>
@@ -4258,8 +5031,49 @@
           <w:rStyle w:val="NormalTok"/>
           <w:rFonts w:ascii="Times New Roman" w:hAnsi="Times New Roman" w:cs="Times New Roman"/>
         </w:rPr>
-        <w:t xml:space="preserve"> foldl' countEntry M.empty</w:t>
-      </w:r>
+        <w:t xml:space="preserve"> </w:t>
+      </w:r>
+      <w:proofErr w:type="spellStart"/>
+      <w:r>
+        <w:rPr>
+          <w:rStyle w:val="NormalTok"/>
+          <w:rFonts w:ascii="Times New Roman" w:hAnsi="Times New Roman" w:cs="Times New Roman"/>
+        </w:rPr>
+        <w:t>foldl</w:t>
+      </w:r>
+      <w:proofErr w:type="spellEnd"/>
+      <w:r>
+        <w:rPr>
+          <w:rStyle w:val="NormalTok"/>
+          <w:rFonts w:ascii="Times New Roman" w:hAnsi="Times New Roman" w:cs="Times New Roman"/>
+        </w:rPr>
+        <w:t xml:space="preserve">' </w:t>
+      </w:r>
+      <w:proofErr w:type="spellStart"/>
+      <w:r>
+        <w:rPr>
+          <w:rStyle w:val="NormalTok"/>
+          <w:rFonts w:ascii="Times New Roman" w:hAnsi="Times New Roman" w:cs="Times New Roman"/>
+        </w:rPr>
+        <w:t>countEntry</w:t>
+      </w:r>
+      <w:proofErr w:type="spellEnd"/>
+      <w:r>
+        <w:rPr>
+          <w:rStyle w:val="NormalTok"/>
+          <w:rFonts w:ascii="Times New Roman" w:hAnsi="Times New Roman" w:cs="Times New Roman"/>
+        </w:rPr>
+        <w:t xml:space="preserve"> </w:t>
+      </w:r>
+      <w:proofErr w:type="spellStart"/>
+      <w:r>
+        <w:rPr>
+          <w:rStyle w:val="NormalTok"/>
+          <w:rFonts w:ascii="Times New Roman" w:hAnsi="Times New Roman" w:cs="Times New Roman"/>
+        </w:rPr>
+        <w:t>M.empty</w:t>
+      </w:r>
+      <w:proofErr w:type="spellEnd"/>
       <w:r>
         <w:rPr>
           <w:rFonts w:ascii="Times New Roman" w:hAnsi="Times New Roman" w:cs="Times New Roman"/>
@@ -4291,7 +5105,23 @@
           <w:rStyle w:val="NormalTok"/>
           <w:rFonts w:ascii="Times New Roman" w:hAnsi="Times New Roman" w:cs="Times New Roman"/>
         </w:rPr>
-        <w:t xml:space="preserve">    countEntry acc entry </w:t>
+        <w:t xml:space="preserve">    </w:t>
+      </w:r>
+      <w:proofErr w:type="spellStart"/>
+      <w:r>
+        <w:rPr>
+          <w:rStyle w:val="NormalTok"/>
+          <w:rFonts w:ascii="Times New Roman" w:hAnsi="Times New Roman" w:cs="Times New Roman"/>
+        </w:rPr>
+        <w:t>countEntry</w:t>
+      </w:r>
+      <w:proofErr w:type="spellEnd"/>
+      <w:r>
+        <w:rPr>
+          <w:rStyle w:val="NormalTok"/>
+          <w:rFonts w:ascii="Times New Roman" w:hAnsi="Times New Roman" w:cs="Times New Roman"/>
+        </w:rPr>
+        <w:t xml:space="preserve"> acc entry </w:t>
       </w:r>
       <w:r>
         <w:rPr>
@@ -4339,7 +5169,39 @@
           <w:rStyle w:val="NormalTok"/>
           <w:rFonts w:ascii="Times New Roman" w:hAnsi="Times New Roman" w:cs="Times New Roman"/>
         </w:rPr>
-        <w:t xml:space="preserve"> statusCategory (leStatusCode entry)</w:t>
+        <w:t xml:space="preserve"> </w:t>
+      </w:r>
+      <w:proofErr w:type="spellStart"/>
+      <w:r>
+        <w:rPr>
+          <w:rStyle w:val="NormalTok"/>
+          <w:rFonts w:ascii="Times New Roman" w:hAnsi="Times New Roman" w:cs="Times New Roman"/>
+        </w:rPr>
+        <w:t>statusCategory</w:t>
+      </w:r>
+      <w:proofErr w:type="spellEnd"/>
+      <w:r>
+        <w:rPr>
+          <w:rStyle w:val="NormalTok"/>
+          <w:rFonts w:ascii="Times New Roman" w:hAnsi="Times New Roman" w:cs="Times New Roman"/>
+        </w:rPr>
+        <w:t xml:space="preserve"> (</w:t>
+      </w:r>
+      <w:proofErr w:type="spellStart"/>
+      <w:r>
+        <w:rPr>
+          <w:rStyle w:val="NormalTok"/>
+          <w:rFonts w:ascii="Times New Roman" w:hAnsi="Times New Roman" w:cs="Times New Roman"/>
+        </w:rPr>
+        <w:t>leStatusCode</w:t>
+      </w:r>
+      <w:proofErr w:type="spellEnd"/>
+      <w:r>
+        <w:rPr>
+          <w:rStyle w:val="NormalTok"/>
+          <w:rFonts w:ascii="Times New Roman" w:hAnsi="Times New Roman" w:cs="Times New Roman"/>
+        </w:rPr>
+        <w:t xml:space="preserve"> entry)</w:t>
       </w:r>
       <w:r>
         <w:rPr>
@@ -4366,7 +5228,23 @@
           <w:rStyle w:val="NormalTok"/>
           <w:rFonts w:ascii="Times New Roman" w:hAnsi="Times New Roman" w:cs="Times New Roman"/>
         </w:rPr>
-        <w:t xml:space="preserve"> M.insertWith (</w:t>
+        <w:t xml:space="preserve"> </w:t>
+      </w:r>
+      <w:proofErr w:type="spellStart"/>
+      <w:r>
+        <w:rPr>
+          <w:rStyle w:val="NormalTok"/>
+          <w:rFonts w:ascii="Times New Roman" w:hAnsi="Times New Roman" w:cs="Times New Roman"/>
+        </w:rPr>
+        <w:t>M.insertWith</w:t>
+      </w:r>
+      <w:proofErr w:type="spellEnd"/>
+      <w:r>
+        <w:rPr>
+          <w:rStyle w:val="NormalTok"/>
+          <w:rFonts w:ascii="Times New Roman" w:hAnsi="Times New Roman" w:cs="Times New Roman"/>
+        </w:rPr>
+        <w:t xml:space="preserve"> (</w:t>
       </w:r>
       <w:r>
         <w:rPr>
@@ -4485,20 +5363,39 @@
           <w:rFonts w:ascii="Times New Roman" w:hAnsi="Times New Roman" w:cs="Times New Roman"/>
         </w:rPr>
       </w:pPr>
-      <w:r>
-        <w:rPr>
-          <w:rStyle w:val="OtherTok"/>
-          <w:rFonts w:ascii="Times New Roman" w:hAnsi="Times New Roman" w:cs="Times New Roman"/>
-        </w:rPr>
-        <w:t>sessionize ::</w:t>
-      </w:r>
-      <w:r>
-        <w:rPr>
-          <w:rStyle w:val="NormalTok"/>
-          <w:rFonts w:ascii="Times New Roman" w:hAnsi="Times New Roman" w:cs="Times New Roman"/>
-        </w:rPr>
-        <w:t xml:space="preserve"> </w:t>
-      </w:r>
+      <w:proofErr w:type="spellStart"/>
+      <w:proofErr w:type="gramStart"/>
+      <w:r>
+        <w:rPr>
+          <w:rStyle w:val="OtherTok"/>
+          <w:rFonts w:ascii="Times New Roman" w:hAnsi="Times New Roman" w:cs="Times New Roman"/>
+        </w:rPr>
+        <w:t>sessionize</w:t>
+      </w:r>
+      <w:proofErr w:type="spellEnd"/>
+      <w:r>
+        <w:rPr>
+          <w:rStyle w:val="OtherTok"/>
+          <w:rFonts w:ascii="Times New Roman" w:hAnsi="Times New Roman" w:cs="Times New Roman"/>
+        </w:rPr>
+        <w:t xml:space="preserve"> :</w:t>
+      </w:r>
+      <w:proofErr w:type="gramEnd"/>
+      <w:r>
+        <w:rPr>
+          <w:rStyle w:val="OtherTok"/>
+          <w:rFonts w:ascii="Times New Roman" w:hAnsi="Times New Roman" w:cs="Times New Roman"/>
+        </w:rPr>
+        <w:t>:</w:t>
+      </w:r>
+      <w:r>
+        <w:rPr>
+          <w:rStyle w:val="NormalTok"/>
+          <w:rFonts w:ascii="Times New Roman" w:hAnsi="Times New Roman" w:cs="Times New Roman"/>
+        </w:rPr>
+        <w:t xml:space="preserve"> </w:t>
+      </w:r>
+      <w:proofErr w:type="spellStart"/>
       <w:r>
         <w:rPr>
           <w:rStyle w:val="DataTypeTok"/>
@@ -4506,6 +5403,7 @@
         </w:rPr>
         <w:t>NominalDiffTime</w:t>
       </w:r>
+      <w:proofErr w:type="spellEnd"/>
       <w:r>
         <w:rPr>
           <w:rStyle w:val="NormalTok"/>
@@ -4527,6 +5425,7 @@
         </w:rPr>
         <w:t xml:space="preserve"> [</w:t>
       </w:r>
+      <w:proofErr w:type="spellStart"/>
       <w:r>
         <w:rPr>
           <w:rStyle w:val="DataTypeTok"/>
@@ -4534,6 +5433,7 @@
         </w:rPr>
         <w:t>LogEntry</w:t>
       </w:r>
+      <w:proofErr w:type="spellEnd"/>
       <w:r>
         <w:rPr>
           <w:rStyle w:val="NormalTok"/>
@@ -4555,6 +5455,7 @@
         </w:rPr>
         <w:t xml:space="preserve"> [[</w:t>
       </w:r>
+      <w:proofErr w:type="spellStart"/>
       <w:r>
         <w:rPr>
           <w:rStyle w:val="DataTypeTok"/>
@@ -4562,6 +5463,7 @@
         </w:rPr>
         <w:t>LogEntry</w:t>
       </w:r>
+      <w:proofErr w:type="spellEnd"/>
       <w:r>
         <w:rPr>
           <w:rStyle w:val="NormalTok"/>
@@ -4575,12 +5477,21 @@
         </w:rPr>
         <w:br/>
       </w:r>
-      <w:r>
-        <w:rPr>
-          <w:rStyle w:val="NormalTok"/>
-          <w:rFonts w:ascii="Times New Roman" w:hAnsi="Times New Roman" w:cs="Times New Roman"/>
-        </w:rPr>
-        <w:t xml:space="preserve">sessionize timeout entries </w:t>
+      <w:proofErr w:type="spellStart"/>
+      <w:r>
+        <w:rPr>
+          <w:rStyle w:val="NormalTok"/>
+          <w:rFonts w:ascii="Times New Roman" w:hAnsi="Times New Roman" w:cs="Times New Roman"/>
+        </w:rPr>
+        <w:t>sessionize</w:t>
+      </w:r>
+      <w:proofErr w:type="spellEnd"/>
+      <w:r>
+        <w:rPr>
+          <w:rStyle w:val="NormalTok"/>
+          <w:rFonts w:ascii="Times New Roman" w:hAnsi="Times New Roman" w:cs="Times New Roman"/>
+        </w:rPr>
+        <w:t xml:space="preserve"> timeout entries </w:t>
       </w:r>
       <w:r>
         <w:rPr>
@@ -4602,6 +5513,7 @@
         </w:rPr>
         <w:t xml:space="preserve">  </w:t>
       </w:r>
+      <w:proofErr w:type="spellStart"/>
       <w:r>
         <w:rPr>
           <w:rStyle w:val="FunctionTok"/>
@@ -4609,12 +5521,45 @@
         </w:rPr>
         <w:t>concatMap</w:t>
       </w:r>
-      <w:r>
-        <w:rPr>
-          <w:rStyle w:val="NormalTok"/>
-          <w:rFonts w:ascii="Times New Roman" w:hAnsi="Times New Roman" w:cs="Times New Roman"/>
-        </w:rPr>
-        <w:t xml:space="preserve"> sessionizeIP groupedByIP </w:t>
+      <w:proofErr w:type="spellEnd"/>
+      <w:r>
+        <w:rPr>
+          <w:rStyle w:val="NormalTok"/>
+          <w:rFonts w:ascii="Times New Roman" w:hAnsi="Times New Roman" w:cs="Times New Roman"/>
+        </w:rPr>
+        <w:t xml:space="preserve"> </w:t>
+      </w:r>
+      <w:proofErr w:type="spellStart"/>
+      <w:r>
+        <w:rPr>
+          <w:rStyle w:val="NormalTok"/>
+          <w:rFonts w:ascii="Times New Roman" w:hAnsi="Times New Roman" w:cs="Times New Roman"/>
+        </w:rPr>
+        <w:t>sessionizeIP</w:t>
+      </w:r>
+      <w:proofErr w:type="spellEnd"/>
+      <w:r>
+        <w:rPr>
+          <w:rStyle w:val="NormalTok"/>
+          <w:rFonts w:ascii="Times New Roman" w:hAnsi="Times New Roman" w:cs="Times New Roman"/>
+        </w:rPr>
+        <w:t xml:space="preserve"> </w:t>
+      </w:r>
+      <w:proofErr w:type="spellStart"/>
+      <w:r>
+        <w:rPr>
+          <w:rStyle w:val="NormalTok"/>
+          <w:rFonts w:ascii="Times New Roman" w:hAnsi="Times New Roman" w:cs="Times New Roman"/>
+        </w:rPr>
+        <w:t>groupedByIP</w:t>
+      </w:r>
+      <w:proofErr w:type="spellEnd"/>
+      <w:r>
+        <w:rPr>
+          <w:rStyle w:val="NormalTok"/>
+          <w:rFonts w:ascii="Times New Roman" w:hAnsi="Times New Roman" w:cs="Times New Roman"/>
+        </w:rPr>
+        <w:t xml:space="preserve"> </w:t>
       </w:r>
       <w:r>
         <w:rPr>
@@ -4628,7 +5573,23 @@
           <w:rStyle w:val="NormalTok"/>
           <w:rFonts w:ascii="Times New Roman" w:hAnsi="Times New Roman" w:cs="Times New Roman"/>
         </w:rPr>
-        <w:t xml:space="preserve"> parBuffer </w:t>
+        <w:t xml:space="preserve"> </w:t>
+      </w:r>
+      <w:proofErr w:type="spellStart"/>
+      <w:r>
+        <w:rPr>
+          <w:rStyle w:val="NormalTok"/>
+          <w:rFonts w:ascii="Times New Roman" w:hAnsi="Times New Roman" w:cs="Times New Roman"/>
+        </w:rPr>
+        <w:t>parBuffer</w:t>
+      </w:r>
+      <w:proofErr w:type="spellEnd"/>
+      <w:r>
+        <w:rPr>
+          <w:rStyle w:val="NormalTok"/>
+          <w:rFonts w:ascii="Times New Roman" w:hAnsi="Times New Roman" w:cs="Times New Roman"/>
+        </w:rPr>
+        <w:t xml:space="preserve"> </w:t>
       </w:r>
       <w:r>
         <w:rPr>
@@ -4642,8 +5603,17 @@
           <w:rStyle w:val="NormalTok"/>
           <w:rFonts w:ascii="Times New Roman" w:hAnsi="Times New Roman" w:cs="Times New Roman"/>
         </w:rPr>
-        <w:t xml:space="preserve"> rseq</w:t>
-      </w:r>
+        <w:t xml:space="preserve"> </w:t>
+      </w:r>
+      <w:proofErr w:type="spellStart"/>
+      <w:r>
+        <w:rPr>
+          <w:rStyle w:val="NormalTok"/>
+          <w:rFonts w:ascii="Times New Roman" w:hAnsi="Times New Roman" w:cs="Times New Roman"/>
+        </w:rPr>
+        <w:t>rseq</w:t>
+      </w:r>
+      <w:proofErr w:type="spellEnd"/>
     </w:p>
     <w:p>
       <w:pPr>
@@ -4671,13 +5641,31 @@
         </w:rPr>
         <w:t xml:space="preserve"> function applies parallel evaluation strategy </w:t>
       </w:r>
+      <w:proofErr w:type="spellStart"/>
       <w:r>
         <w:rPr>
           <w:rStyle w:val="VerbatimChar"/>
           <w:rFonts w:ascii="Times New Roman" w:hAnsi="Times New Roman" w:cs="Times New Roman"/>
         </w:rPr>
-        <w:t>parBuffer 100 rseq</w:t>
-      </w:r>
+        <w:t>parBuffer</w:t>
+      </w:r>
+      <w:proofErr w:type="spellEnd"/>
+      <w:r>
+        <w:rPr>
+          <w:rStyle w:val="VerbatimChar"/>
+          <w:rFonts w:ascii="Times New Roman" w:hAnsi="Times New Roman" w:cs="Times New Roman"/>
+        </w:rPr>
+        <w:t xml:space="preserve"> 100 </w:t>
+      </w:r>
+      <w:proofErr w:type="spellStart"/>
+      <w:r>
+        <w:rPr>
+          <w:rStyle w:val="VerbatimChar"/>
+          <w:rFonts w:ascii="Times New Roman" w:hAnsi="Times New Roman" w:cs="Times New Roman"/>
+        </w:rPr>
+        <w:t>rseq</w:t>
+      </w:r>
+      <w:proofErr w:type="spellEnd"/>
       <w:r>
         <w:rPr>
           <w:rFonts w:ascii="Times New Roman" w:hAnsi="Times New Roman" w:cs="Times New Roman"/>
@@ -4750,12 +5738,30 @@
           <w:rFonts w:ascii="Times New Roman" w:hAnsi="Times New Roman" w:cs="Times New Roman"/>
         </w:rPr>
       </w:pPr>
-      <w:r>
-        <w:rPr>
-          <w:rStyle w:val="OtherTok"/>
-          <w:rFonts w:ascii="Times New Roman" w:hAnsi="Times New Roman" w:cs="Times New Roman"/>
-        </w:rPr>
-        <w:t>parseLogLine ::</w:t>
+      <w:proofErr w:type="spellStart"/>
+      <w:proofErr w:type="gramStart"/>
+      <w:r>
+        <w:rPr>
+          <w:rStyle w:val="OtherTok"/>
+          <w:rFonts w:ascii="Times New Roman" w:hAnsi="Times New Roman" w:cs="Times New Roman"/>
+        </w:rPr>
+        <w:t>parseLogLine</w:t>
+      </w:r>
+      <w:proofErr w:type="spellEnd"/>
+      <w:r>
+        <w:rPr>
+          <w:rStyle w:val="OtherTok"/>
+          <w:rFonts w:ascii="Times New Roman" w:hAnsi="Times New Roman" w:cs="Times New Roman"/>
+        </w:rPr>
+        <w:t xml:space="preserve"> :</w:t>
+      </w:r>
+      <w:proofErr w:type="gramEnd"/>
+      <w:r>
+        <w:rPr>
+          <w:rStyle w:val="OtherTok"/>
+          <w:rFonts w:ascii="Times New Roman" w:hAnsi="Times New Roman" w:cs="Times New Roman"/>
+        </w:rPr>
+        <w:t>:</w:t>
       </w:r>
       <w:r>
         <w:rPr>
@@ -4806,6 +5812,7 @@
         </w:rPr>
         <w:t xml:space="preserve"> </w:t>
       </w:r>
+      <w:proofErr w:type="spellStart"/>
       <w:r>
         <w:rPr>
           <w:rStyle w:val="DataTypeTok"/>
@@ -4813,18 +5820,28 @@
         </w:rPr>
         <w:t>LogEntry</w:t>
       </w:r>
+      <w:proofErr w:type="spellEnd"/>
       <w:r>
         <w:rPr>
           <w:rFonts w:ascii="Times New Roman" w:hAnsi="Times New Roman" w:cs="Times New Roman"/>
         </w:rPr>
         <w:br/>
       </w:r>
-      <w:r>
-        <w:rPr>
-          <w:rStyle w:val="NormalTok"/>
-          <w:rFonts w:ascii="Times New Roman" w:hAnsi="Times New Roman" w:cs="Times New Roman"/>
-        </w:rPr>
-        <w:t xml:space="preserve">parseLogLine line </w:t>
+      <w:proofErr w:type="spellStart"/>
+      <w:r>
+        <w:rPr>
+          <w:rStyle w:val="NormalTok"/>
+          <w:rFonts w:ascii="Times New Roman" w:hAnsi="Times New Roman" w:cs="Times New Roman"/>
+        </w:rPr>
+        <w:t>parseLogLine</w:t>
+      </w:r>
+      <w:proofErr w:type="spellEnd"/>
+      <w:r>
+        <w:rPr>
+          <w:rStyle w:val="NormalTok"/>
+          <w:rFonts w:ascii="Times New Roman" w:hAnsi="Times New Roman" w:cs="Times New Roman"/>
+        </w:rPr>
+        <w:t xml:space="preserve"> line </w:t>
       </w:r>
       <w:r>
         <w:rPr>
@@ -4858,6 +5875,7 @@
           <w:rStyle w:val="NormalTok"/>
           <w:rFonts w:ascii="Times New Roman" w:hAnsi="Times New Roman" w:cs="Times New Roman"/>
         </w:rPr>
+        <w:lastRenderedPageBreak/>
         <w:t xml:space="preserve">  </w:t>
       </w:r>
       <w:r>
@@ -4892,7 +5910,39 @@
           <w:rStyle w:val="NormalTok"/>
           <w:rFonts w:ascii="Times New Roman" w:hAnsi="Times New Roman" w:cs="Times New Roman"/>
         </w:rPr>
-        <w:t xml:space="preserve"> parseTimestamp timeStr  </w:t>
+        <w:t xml:space="preserve"> </w:t>
+      </w:r>
+      <w:proofErr w:type="spellStart"/>
+      <w:r>
+        <w:rPr>
+          <w:rStyle w:val="NormalTok"/>
+          <w:rFonts w:ascii="Times New Roman" w:hAnsi="Times New Roman" w:cs="Times New Roman"/>
+        </w:rPr>
+        <w:t>parseTimestamp</w:t>
+      </w:r>
+      <w:proofErr w:type="spellEnd"/>
+      <w:r>
+        <w:rPr>
+          <w:rStyle w:val="NormalTok"/>
+          <w:rFonts w:ascii="Times New Roman" w:hAnsi="Times New Roman" w:cs="Times New Roman"/>
+        </w:rPr>
+        <w:t xml:space="preserve"> </w:t>
+      </w:r>
+      <w:proofErr w:type="spellStart"/>
+      <w:r>
+        <w:rPr>
+          <w:rStyle w:val="NormalTok"/>
+          <w:rFonts w:ascii="Times New Roman" w:hAnsi="Times New Roman" w:cs="Times New Roman"/>
+        </w:rPr>
+        <w:t>timeStr</w:t>
+      </w:r>
+      <w:proofErr w:type="spellEnd"/>
+      <w:r>
+        <w:rPr>
+          <w:rStyle w:val="NormalTok"/>
+          <w:rFonts w:ascii="Times New Roman" w:hAnsi="Times New Roman" w:cs="Times New Roman"/>
+        </w:rPr>
+        <w:t xml:space="preserve">  </w:t>
       </w:r>
       <w:r>
         <w:rPr>
@@ -4912,7 +5962,6 @@
           <w:rStyle w:val="NormalTok"/>
           <w:rFonts w:ascii="Times New Roman" w:hAnsi="Times New Roman" w:cs="Times New Roman"/>
         </w:rPr>
-        <w:lastRenderedPageBreak/>
         <w:t xml:space="preserve">  method </w:t>
       </w:r>
       <w:r>
@@ -4927,8 +5976,33 @@
           <w:rStyle w:val="NormalTok"/>
           <w:rFonts w:ascii="Times New Roman" w:hAnsi="Times New Roman" w:cs="Times New Roman"/>
         </w:rPr>
-        <w:t xml:space="preserve"> parseMethod methodStr</w:t>
-      </w:r>
+        <w:t xml:space="preserve"> </w:t>
+      </w:r>
+      <w:proofErr w:type="spellStart"/>
+      <w:r>
+        <w:rPr>
+          <w:rStyle w:val="NormalTok"/>
+          <w:rFonts w:ascii="Times New Roman" w:hAnsi="Times New Roman" w:cs="Times New Roman"/>
+        </w:rPr>
+        <w:t>parseMethod</w:t>
+      </w:r>
+      <w:proofErr w:type="spellEnd"/>
+      <w:r>
+        <w:rPr>
+          <w:rStyle w:val="NormalTok"/>
+          <w:rFonts w:ascii="Times New Roman" w:hAnsi="Times New Roman" w:cs="Times New Roman"/>
+        </w:rPr>
+        <w:t xml:space="preserve"> </w:t>
+      </w:r>
+      <w:proofErr w:type="spellStart"/>
+      <w:r>
+        <w:rPr>
+          <w:rStyle w:val="NormalTok"/>
+          <w:rFonts w:ascii="Times New Roman" w:hAnsi="Times New Roman" w:cs="Times New Roman"/>
+        </w:rPr>
+        <w:t>methodStr</w:t>
+      </w:r>
+      <w:proofErr w:type="spellEnd"/>
       <w:r>
         <w:rPr>
           <w:rFonts w:ascii="Times New Roman" w:hAnsi="Times New Roman" w:cs="Times New Roman"/>
@@ -4954,8 +6028,33 @@
           <w:rStyle w:val="NormalTok"/>
           <w:rFonts w:ascii="Times New Roman" w:hAnsi="Times New Roman" w:cs="Times New Roman"/>
         </w:rPr>
-        <w:t xml:space="preserve"> readMaybe statusStr</w:t>
-      </w:r>
+        <w:t xml:space="preserve"> </w:t>
+      </w:r>
+      <w:proofErr w:type="spellStart"/>
+      <w:r>
+        <w:rPr>
+          <w:rStyle w:val="NormalTok"/>
+          <w:rFonts w:ascii="Times New Roman" w:hAnsi="Times New Roman" w:cs="Times New Roman"/>
+        </w:rPr>
+        <w:t>readMaybe</w:t>
+      </w:r>
+      <w:proofErr w:type="spellEnd"/>
+      <w:r>
+        <w:rPr>
+          <w:rStyle w:val="NormalTok"/>
+          <w:rFonts w:ascii="Times New Roman" w:hAnsi="Times New Roman" w:cs="Times New Roman"/>
+        </w:rPr>
+        <w:t xml:space="preserve"> </w:t>
+      </w:r>
+      <w:proofErr w:type="spellStart"/>
+      <w:r>
+        <w:rPr>
+          <w:rStyle w:val="NormalTok"/>
+          <w:rFonts w:ascii="Times New Roman" w:hAnsi="Times New Roman" w:cs="Times New Roman"/>
+        </w:rPr>
+        <w:t>statusStr</w:t>
+      </w:r>
+      <w:proofErr w:type="spellEnd"/>
       <w:r>
         <w:rPr>
           <w:rFonts w:ascii="Times New Roman" w:hAnsi="Times New Roman" w:cs="Times New Roman"/>
@@ -4983,6 +6082,7 @@
         </w:rPr>
         <w:t xml:space="preserve"> </w:t>
       </w:r>
+      <w:proofErr w:type="spellStart"/>
       <w:r>
         <w:rPr>
           <w:rStyle w:val="DataTypeTok"/>
@@ -4990,6 +6090,7 @@
         </w:rPr>
         <w:t>LogEntry</w:t>
       </w:r>
+      <w:proofErr w:type="spellEnd"/>
       <w:r>
         <w:rPr>
           <w:rStyle w:val="NormalTok"/>
@@ -5041,12 +6142,21 @@
           <w:rFonts w:ascii="Times New Roman" w:hAnsi="Times New Roman" w:cs="Times New Roman"/>
         </w:rPr>
       </w:pPr>
-      <w:r>
-        <w:rPr>
-          <w:rStyle w:val="OtherTok"/>
-          <w:rFonts w:ascii="Times New Roman" w:hAnsi="Times New Roman" w:cs="Times New Roman"/>
-        </w:rPr>
-        <w:t>main ::</w:t>
+      <w:proofErr w:type="gramStart"/>
+      <w:r>
+        <w:rPr>
+          <w:rStyle w:val="OtherTok"/>
+          <w:rFonts w:ascii="Times New Roman" w:hAnsi="Times New Roman" w:cs="Times New Roman"/>
+        </w:rPr>
+        <w:t>main :</w:t>
+      </w:r>
+      <w:proofErr w:type="gramEnd"/>
+      <w:r>
+        <w:rPr>
+          <w:rStyle w:val="OtherTok"/>
+          <w:rFonts w:ascii="Times New Roman" w:hAnsi="Times New Roman" w:cs="Times New Roman"/>
+        </w:rPr>
+        <w:t>:</w:t>
       </w:r>
       <w:r>
         <w:rPr>
@@ -5114,7 +6224,23 @@
           <w:rStyle w:val="NormalTok"/>
           <w:rFonts w:ascii="Times New Roman" w:hAnsi="Times New Roman" w:cs="Times New Roman"/>
         </w:rPr>
-        <w:t xml:space="preserve">  filePath </w:t>
+        <w:t xml:space="preserve">  </w:t>
+      </w:r>
+      <w:proofErr w:type="spellStart"/>
+      <w:r>
+        <w:rPr>
+          <w:rStyle w:val="NormalTok"/>
+          <w:rFonts w:ascii="Times New Roman" w:hAnsi="Times New Roman" w:cs="Times New Roman"/>
+        </w:rPr>
+        <w:t>filePath</w:t>
+      </w:r>
+      <w:proofErr w:type="spellEnd"/>
+      <w:r>
+        <w:rPr>
+          <w:rStyle w:val="NormalTok"/>
+          <w:rFonts w:ascii="Times New Roman" w:hAnsi="Times New Roman" w:cs="Times New Roman"/>
+        </w:rPr>
+        <w:t xml:space="preserve"> </w:t>
       </w:r>
       <w:r>
         <w:rPr>
@@ -5128,7 +6254,23 @@
           <w:rStyle w:val="NormalTok"/>
           <w:rFonts w:ascii="Times New Roman" w:hAnsi="Times New Roman" w:cs="Times New Roman"/>
         </w:rPr>
-        <w:t xml:space="preserve"> getFilePath         </w:t>
+        <w:t xml:space="preserve"> </w:t>
+      </w:r>
+      <w:proofErr w:type="spellStart"/>
+      <w:r>
+        <w:rPr>
+          <w:rStyle w:val="NormalTok"/>
+          <w:rFonts w:ascii="Times New Roman" w:hAnsi="Times New Roman" w:cs="Times New Roman"/>
+        </w:rPr>
+        <w:t>getFilePath</w:t>
+      </w:r>
+      <w:proofErr w:type="spellEnd"/>
+      <w:r>
+        <w:rPr>
+          <w:rStyle w:val="NormalTok"/>
+          <w:rFonts w:ascii="Times New Roman" w:hAnsi="Times New Roman" w:cs="Times New Roman"/>
+        </w:rPr>
+        <w:t xml:space="preserve">         </w:t>
       </w:r>
       <w:r>
         <w:rPr>
@@ -5162,7 +6304,39 @@
           <w:rStyle w:val="NormalTok"/>
           <w:rFonts w:ascii="Times New Roman" w:hAnsi="Times New Roman" w:cs="Times New Roman"/>
         </w:rPr>
-        <w:t xml:space="preserve"> readLogFile filePath </w:t>
+        <w:t xml:space="preserve"> </w:t>
+      </w:r>
+      <w:proofErr w:type="spellStart"/>
+      <w:r>
+        <w:rPr>
+          <w:rStyle w:val="NormalTok"/>
+          <w:rFonts w:ascii="Times New Roman" w:hAnsi="Times New Roman" w:cs="Times New Roman"/>
+        </w:rPr>
+        <w:t>readLogFile</w:t>
+      </w:r>
+      <w:proofErr w:type="spellEnd"/>
+      <w:r>
+        <w:rPr>
+          <w:rStyle w:val="NormalTok"/>
+          <w:rFonts w:ascii="Times New Roman" w:hAnsi="Times New Roman" w:cs="Times New Roman"/>
+        </w:rPr>
+        <w:t xml:space="preserve"> </w:t>
+      </w:r>
+      <w:proofErr w:type="spellStart"/>
+      <w:r>
+        <w:rPr>
+          <w:rStyle w:val="NormalTok"/>
+          <w:rFonts w:ascii="Times New Roman" w:hAnsi="Times New Roman" w:cs="Times New Roman"/>
+        </w:rPr>
+        <w:t>filePath</w:t>
+      </w:r>
+      <w:proofErr w:type="spellEnd"/>
+      <w:r>
+        <w:rPr>
+          <w:rStyle w:val="NormalTok"/>
+          <w:rFonts w:ascii="Times New Roman" w:hAnsi="Times New Roman" w:cs="Times New Roman"/>
+        </w:rPr>
+        <w:t xml:space="preserve"> </w:t>
       </w:r>
       <w:r>
         <w:rPr>
@@ -5210,7 +6384,23 @@
           <w:rStyle w:val="NormalTok"/>
           <w:rFonts w:ascii="Times New Roman" w:hAnsi="Times New Roman" w:cs="Times New Roman"/>
         </w:rPr>
-        <w:t xml:space="preserve"> parseLogFile content   </w:t>
+        <w:t xml:space="preserve"> </w:t>
+      </w:r>
+      <w:proofErr w:type="spellStart"/>
+      <w:r>
+        <w:rPr>
+          <w:rStyle w:val="NormalTok"/>
+          <w:rFonts w:ascii="Times New Roman" w:hAnsi="Times New Roman" w:cs="Times New Roman"/>
+        </w:rPr>
+        <w:t>parseLogFile</w:t>
+      </w:r>
+      <w:proofErr w:type="spellEnd"/>
+      <w:r>
+        <w:rPr>
+          <w:rStyle w:val="NormalTok"/>
+          <w:rFonts w:ascii="Times New Roman" w:hAnsi="Times New Roman" w:cs="Times New Roman"/>
+        </w:rPr>
+        <w:t xml:space="preserve"> content   </w:t>
       </w:r>
       <w:r>
         <w:rPr>
@@ -5258,7 +6448,23 @@
           <w:rStyle w:val="NormalTok"/>
           <w:rFonts w:ascii="Times New Roman" w:hAnsi="Times New Roman" w:cs="Times New Roman"/>
         </w:rPr>
-        <w:t xml:space="preserve"> processLogs entries     </w:t>
+        <w:t xml:space="preserve"> </w:t>
+      </w:r>
+      <w:proofErr w:type="spellStart"/>
+      <w:r>
+        <w:rPr>
+          <w:rStyle w:val="NormalTok"/>
+          <w:rFonts w:ascii="Times New Roman" w:hAnsi="Times New Roman" w:cs="Times New Roman"/>
+        </w:rPr>
+        <w:t>processLogs</w:t>
+      </w:r>
+      <w:proofErr w:type="spellEnd"/>
+      <w:r>
+        <w:rPr>
+          <w:rStyle w:val="NormalTok"/>
+          <w:rFonts w:ascii="Times New Roman" w:hAnsi="Times New Roman" w:cs="Times New Roman"/>
+        </w:rPr>
+        <w:t xml:space="preserve"> entries     </w:t>
       </w:r>
       <w:r>
         <w:rPr>
@@ -5278,7 +6484,23 @@
           <w:rStyle w:val="NormalTok"/>
           <w:rFonts w:ascii="Times New Roman" w:hAnsi="Times New Roman" w:cs="Times New Roman"/>
         </w:rPr>
-        <w:t xml:space="preserve">  writeReport result               </w:t>
+        <w:t xml:space="preserve">  </w:t>
+      </w:r>
+      <w:proofErr w:type="spellStart"/>
+      <w:r>
+        <w:rPr>
+          <w:rStyle w:val="NormalTok"/>
+          <w:rFonts w:ascii="Times New Roman" w:hAnsi="Times New Roman" w:cs="Times New Roman"/>
+        </w:rPr>
+        <w:t>writeReport</w:t>
+      </w:r>
+      <w:proofErr w:type="spellEnd"/>
+      <w:r>
+        <w:rPr>
+          <w:rStyle w:val="NormalTok"/>
+          <w:rFonts w:ascii="Times New Roman" w:hAnsi="Times New Roman" w:cs="Times New Roman"/>
+        </w:rPr>
+        <w:t xml:space="preserve"> result               </w:t>
       </w:r>
       <w:r>
         <w:rPr>
@@ -5355,12 +6577,30 @@
           <w:rFonts w:ascii="Times New Roman" w:hAnsi="Times New Roman" w:cs="Times New Roman"/>
         </w:rPr>
       </w:pPr>
-      <w:r>
-        <w:rPr>
-          <w:rStyle w:val="OtherTok"/>
-          <w:rFonts w:ascii="Times New Roman" w:hAnsi="Times New Roman" w:cs="Times New Roman"/>
-        </w:rPr>
-        <w:t>topIPs ::</w:t>
+      <w:proofErr w:type="spellStart"/>
+      <w:proofErr w:type="gramStart"/>
+      <w:r>
+        <w:rPr>
+          <w:rStyle w:val="OtherTok"/>
+          <w:rFonts w:ascii="Times New Roman" w:hAnsi="Times New Roman" w:cs="Times New Roman"/>
+        </w:rPr>
+        <w:t>topIPs</w:t>
+      </w:r>
+      <w:proofErr w:type="spellEnd"/>
+      <w:r>
+        <w:rPr>
+          <w:rStyle w:val="OtherTok"/>
+          <w:rFonts w:ascii="Times New Roman" w:hAnsi="Times New Roman" w:cs="Times New Roman"/>
+        </w:rPr>
+        <w:t xml:space="preserve"> :</w:t>
+      </w:r>
+      <w:proofErr w:type="gramEnd"/>
+      <w:r>
+        <w:rPr>
+          <w:rStyle w:val="OtherTok"/>
+          <w:rFonts w:ascii="Times New Roman" w:hAnsi="Times New Roman" w:cs="Times New Roman"/>
+        </w:rPr>
+        <w:t>:</w:t>
       </w:r>
       <w:r>
         <w:rPr>
@@ -5397,6 +6637,7 @@
         </w:rPr>
         <w:t xml:space="preserve"> [</w:t>
       </w:r>
+      <w:proofErr w:type="spellStart"/>
       <w:r>
         <w:rPr>
           <w:rStyle w:val="DataTypeTok"/>
@@ -5404,6 +6645,7 @@
         </w:rPr>
         <w:t>LogEntry</w:t>
       </w:r>
+      <w:proofErr w:type="spellEnd"/>
       <w:r>
         <w:rPr>
           <w:rStyle w:val="NormalTok"/>
@@ -5459,20 +6701,30 @@
         </w:rPr>
         <w:br/>
       </w:r>
-      <w:r>
-        <w:rPr>
-          <w:rStyle w:val="OtherTok"/>
-          <w:rFonts w:ascii="Times New Roman" w:hAnsi="Times New Roman" w:cs="Times New Roman"/>
-        </w:rPr>
-        <w:t>errorsOverTime ::</w:t>
-      </w:r>
-      <w:r>
-        <w:rPr>
-          <w:rStyle w:val="NormalTok"/>
-          <w:rFonts w:ascii="Times New Roman" w:hAnsi="Times New Roman" w:cs="Times New Roman"/>
-        </w:rPr>
-        <w:t xml:space="preserve"> </w:t>
-      </w:r>
+      <w:proofErr w:type="spellStart"/>
+      <w:r>
+        <w:rPr>
+          <w:rStyle w:val="OtherTok"/>
+          <w:rFonts w:ascii="Times New Roman" w:hAnsi="Times New Roman" w:cs="Times New Roman"/>
+        </w:rPr>
+        <w:t>errorsOverTime</w:t>
+      </w:r>
+      <w:proofErr w:type="spellEnd"/>
+      <w:r>
+        <w:rPr>
+          <w:rStyle w:val="OtherTok"/>
+          <w:rFonts w:ascii="Times New Roman" w:hAnsi="Times New Roman" w:cs="Times New Roman"/>
+        </w:rPr>
+        <w:t xml:space="preserve"> ::</w:t>
+      </w:r>
+      <w:r>
+        <w:rPr>
+          <w:rStyle w:val="NormalTok"/>
+          <w:rFonts w:ascii="Times New Roman" w:hAnsi="Times New Roman" w:cs="Times New Roman"/>
+        </w:rPr>
+        <w:t xml:space="preserve"> </w:t>
+      </w:r>
+      <w:proofErr w:type="spellStart"/>
       <w:r>
         <w:rPr>
           <w:rStyle w:val="DataTypeTok"/>
@@ -5480,6 +6732,7 @@
         </w:rPr>
         <w:t>NominalDiffTime</w:t>
       </w:r>
+      <w:proofErr w:type="spellEnd"/>
       <w:r>
         <w:rPr>
           <w:rStyle w:val="NormalTok"/>
@@ -5501,6 +6754,7 @@
         </w:rPr>
         <w:t xml:space="preserve"> [</w:t>
       </w:r>
+      <w:proofErr w:type="spellStart"/>
       <w:r>
         <w:rPr>
           <w:rStyle w:val="DataTypeTok"/>
@@ -5508,6 +6762,7 @@
         </w:rPr>
         <w:t>LogEntry</w:t>
       </w:r>
+      <w:proofErr w:type="spellEnd"/>
       <w:r>
         <w:rPr>
           <w:rStyle w:val="NormalTok"/>
@@ -5529,6 +6784,7 @@
         </w:rPr>
         <w:t xml:space="preserve"> [(</w:t>
       </w:r>
+      <w:proofErr w:type="spellStart"/>
       <w:r>
         <w:rPr>
           <w:rStyle w:val="DataTypeTok"/>
@@ -5536,6 +6792,7 @@
         </w:rPr>
         <w:t>UTCTime</w:t>
       </w:r>
+      <w:proofErr w:type="spellEnd"/>
       <w:r>
         <w:rPr>
           <w:rStyle w:val="NormalTok"/>
@@ -5563,20 +6820,30 @@
         </w:rPr>
         <w:br/>
       </w:r>
-      <w:r>
-        <w:rPr>
-          <w:rStyle w:val="OtherTok"/>
-          <w:rFonts w:ascii="Times New Roman" w:hAnsi="Times New Roman" w:cs="Times New Roman"/>
-        </w:rPr>
-        <w:t>sessionize ::</w:t>
-      </w:r>
-      <w:r>
-        <w:rPr>
-          <w:rStyle w:val="NormalTok"/>
-          <w:rFonts w:ascii="Times New Roman" w:hAnsi="Times New Roman" w:cs="Times New Roman"/>
-        </w:rPr>
-        <w:t xml:space="preserve"> </w:t>
-      </w:r>
+      <w:proofErr w:type="spellStart"/>
+      <w:r>
+        <w:rPr>
+          <w:rStyle w:val="OtherTok"/>
+          <w:rFonts w:ascii="Times New Roman" w:hAnsi="Times New Roman" w:cs="Times New Roman"/>
+        </w:rPr>
+        <w:t>sessionize</w:t>
+      </w:r>
+      <w:proofErr w:type="spellEnd"/>
+      <w:r>
+        <w:rPr>
+          <w:rStyle w:val="OtherTok"/>
+          <w:rFonts w:ascii="Times New Roman" w:hAnsi="Times New Roman" w:cs="Times New Roman"/>
+        </w:rPr>
+        <w:t xml:space="preserve"> ::</w:t>
+      </w:r>
+      <w:r>
+        <w:rPr>
+          <w:rStyle w:val="NormalTok"/>
+          <w:rFonts w:ascii="Times New Roman" w:hAnsi="Times New Roman" w:cs="Times New Roman"/>
+        </w:rPr>
+        <w:t xml:space="preserve"> </w:t>
+      </w:r>
+      <w:proofErr w:type="spellStart"/>
       <w:r>
         <w:rPr>
           <w:rStyle w:val="DataTypeTok"/>
@@ -5584,6 +6851,7 @@
         </w:rPr>
         <w:t>NominalDiffTime</w:t>
       </w:r>
+      <w:proofErr w:type="spellEnd"/>
       <w:r>
         <w:rPr>
           <w:rStyle w:val="NormalTok"/>
@@ -5605,6 +6873,7 @@
         </w:rPr>
         <w:t xml:space="preserve"> [</w:t>
       </w:r>
+      <w:proofErr w:type="spellStart"/>
       <w:r>
         <w:rPr>
           <w:rStyle w:val="DataTypeTok"/>
@@ -5612,6 +6881,7 @@
         </w:rPr>
         <w:t>LogEntry</w:t>
       </w:r>
+      <w:proofErr w:type="spellEnd"/>
       <w:r>
         <w:rPr>
           <w:rStyle w:val="NormalTok"/>
@@ -5633,6 +6903,7 @@
         </w:rPr>
         <w:t xml:space="preserve"> [[</w:t>
       </w:r>
+      <w:proofErr w:type="spellStart"/>
       <w:r>
         <w:rPr>
           <w:rStyle w:val="DataTypeTok"/>
@@ -5640,6 +6911,7 @@
         </w:rPr>
         <w:t>LogEntry</w:t>
       </w:r>
+      <w:proofErr w:type="spellEnd"/>
       <w:r>
         <w:rPr>
           <w:rStyle w:val="NormalTok"/>
@@ -5661,12 +6933,46 @@
         </w:rPr>
         <w:t xml:space="preserve">The type signature </w:t>
       </w:r>
+      <w:proofErr w:type="spellStart"/>
+      <w:proofErr w:type="gramStart"/>
       <w:r>
         <w:rPr>
           <w:rStyle w:val="VerbatimChar"/>
           <w:rFonts w:ascii="Times New Roman" w:hAnsi="Times New Roman" w:cs="Times New Roman"/>
         </w:rPr>
-        <w:t>topIPs :: Int -&gt; [LogEntry] -&gt; [(String, Int)]</w:t>
+        <w:t>topIPs</w:t>
+      </w:r>
+      <w:proofErr w:type="spellEnd"/>
+      <w:r>
+        <w:rPr>
+          <w:rStyle w:val="VerbatimChar"/>
+          <w:rFonts w:ascii="Times New Roman" w:hAnsi="Times New Roman" w:cs="Times New Roman"/>
+        </w:rPr>
+        <w:t xml:space="preserve"> :</w:t>
+      </w:r>
+      <w:proofErr w:type="gramEnd"/>
+      <w:r>
+        <w:rPr>
+          <w:rStyle w:val="VerbatimChar"/>
+          <w:rFonts w:ascii="Times New Roman" w:hAnsi="Times New Roman" w:cs="Times New Roman"/>
+        </w:rPr>
+        <w:t>: Int -&gt; [</w:t>
+      </w:r>
+      <w:proofErr w:type="spellStart"/>
+      <w:r>
+        <w:rPr>
+          <w:rStyle w:val="VerbatimChar"/>
+          <w:rFonts w:ascii="Times New Roman" w:hAnsi="Times New Roman" w:cs="Times New Roman"/>
+        </w:rPr>
+        <w:t>LogEntry</w:t>
+      </w:r>
+      <w:proofErr w:type="spellEnd"/>
+      <w:r>
+        <w:rPr>
+          <w:rStyle w:val="VerbatimChar"/>
+          <w:rFonts w:ascii="Times New Roman" w:hAnsi="Times New Roman" w:cs="Times New Roman"/>
+        </w:rPr>
+        <w:t>] -&gt; [(String, Int)]</w:t>
       </w:r>
       <w:r>
         <w:rPr>
@@ -5720,13 +7026,23 @@
           <w:rFonts w:ascii="Times New Roman" w:hAnsi="Times New Roman" w:cs="Times New Roman"/>
         </w:rPr>
       </w:pPr>
+      <w:proofErr w:type="spellStart"/>
       <w:r>
         <w:rPr>
           <w:rFonts w:ascii="Times New Roman" w:hAnsi="Times New Roman" w:cs="Times New Roman"/>
           <w:b/>
           <w:bCs/>
         </w:rPr>
-        <w:t>Destructure data elegantly</w:t>
+        <w:t>Destructure</w:t>
+      </w:r>
+      <w:proofErr w:type="spellEnd"/>
+      <w:r>
+        <w:rPr>
+          <w:rFonts w:ascii="Times New Roman" w:hAnsi="Times New Roman" w:cs="Times New Roman"/>
+          <w:b/>
+          <w:bCs/>
+        </w:rPr>
+        <w:t xml:space="preserve"> data elegantly</w:t>
       </w:r>
       <w:r>
         <w:rPr>
@@ -5742,12 +7058,30 @@
           <w:rFonts w:ascii="Times New Roman" w:hAnsi="Times New Roman" w:cs="Times New Roman"/>
         </w:rPr>
       </w:pPr>
-      <w:r>
-        <w:rPr>
-          <w:rStyle w:val="OtherTok"/>
-          <w:rFonts w:ascii="Times New Roman" w:hAnsi="Times New Roman" w:cs="Times New Roman"/>
-        </w:rPr>
-        <w:t>parseMethod ::</w:t>
+      <w:proofErr w:type="spellStart"/>
+      <w:proofErr w:type="gramStart"/>
+      <w:r>
+        <w:rPr>
+          <w:rStyle w:val="OtherTok"/>
+          <w:rFonts w:ascii="Times New Roman" w:hAnsi="Times New Roman" w:cs="Times New Roman"/>
+        </w:rPr>
+        <w:t>parseMethod</w:t>
+      </w:r>
+      <w:proofErr w:type="spellEnd"/>
+      <w:r>
+        <w:rPr>
+          <w:rStyle w:val="OtherTok"/>
+          <w:rFonts w:ascii="Times New Roman" w:hAnsi="Times New Roman" w:cs="Times New Roman"/>
+        </w:rPr>
+        <w:t xml:space="preserve"> :</w:t>
+      </w:r>
+      <w:proofErr w:type="gramEnd"/>
+      <w:r>
+        <w:rPr>
+          <w:rStyle w:val="OtherTok"/>
+          <w:rFonts w:ascii="Times New Roman" w:hAnsi="Times New Roman" w:cs="Times New Roman"/>
+        </w:rPr>
+        <w:t>:</w:t>
       </w:r>
       <w:r>
         <w:rPr>
@@ -5798,6 +7132,7 @@
         </w:rPr>
         <w:t xml:space="preserve"> </w:t>
       </w:r>
+      <w:proofErr w:type="spellStart"/>
       <w:r>
         <w:rPr>
           <w:rStyle w:val="DataTypeTok"/>
@@ -5805,18 +7140,28 @@
         </w:rPr>
         <w:t>HttpMethod</w:t>
       </w:r>
+      <w:proofErr w:type="spellEnd"/>
       <w:r>
         <w:rPr>
           <w:rFonts w:ascii="Times New Roman" w:hAnsi="Times New Roman" w:cs="Times New Roman"/>
         </w:rPr>
         <w:br/>
       </w:r>
-      <w:r>
-        <w:rPr>
-          <w:rStyle w:val="NormalTok"/>
-          <w:rFonts w:ascii="Times New Roman" w:hAnsi="Times New Roman" w:cs="Times New Roman"/>
-        </w:rPr>
-        <w:t xml:space="preserve">parseMethod </w:t>
+      <w:proofErr w:type="spellStart"/>
+      <w:r>
+        <w:rPr>
+          <w:rStyle w:val="NormalTok"/>
+          <w:rFonts w:ascii="Times New Roman" w:hAnsi="Times New Roman" w:cs="Times New Roman"/>
+        </w:rPr>
+        <w:t>parseMethod</w:t>
+      </w:r>
+      <w:proofErr w:type="spellEnd"/>
+      <w:r>
+        <w:rPr>
+          <w:rStyle w:val="NormalTok"/>
+          <w:rFonts w:ascii="Times New Roman" w:hAnsi="Times New Roman" w:cs="Times New Roman"/>
+        </w:rPr>
+        <w:t xml:space="preserve"> </w:t>
       </w:r>
       <w:r>
         <w:rPr>
@@ -5873,12 +7218,21 @@
         </w:rPr>
         <w:br/>
       </w:r>
-      <w:r>
-        <w:rPr>
-          <w:rStyle w:val="NormalTok"/>
-          <w:rFonts w:ascii="Times New Roman" w:hAnsi="Times New Roman" w:cs="Times New Roman"/>
-        </w:rPr>
-        <w:t xml:space="preserve">parseMethod </w:t>
+      <w:proofErr w:type="spellStart"/>
+      <w:r>
+        <w:rPr>
+          <w:rStyle w:val="NormalTok"/>
+          <w:rFonts w:ascii="Times New Roman" w:hAnsi="Times New Roman" w:cs="Times New Roman"/>
+        </w:rPr>
+        <w:t>parseMethod</w:t>
+      </w:r>
+      <w:proofErr w:type="spellEnd"/>
+      <w:r>
+        <w:rPr>
+          <w:rStyle w:val="NormalTok"/>
+          <w:rFonts w:ascii="Times New Roman" w:hAnsi="Times New Roman" w:cs="Times New Roman"/>
+        </w:rPr>
+        <w:t xml:space="preserve"> </w:t>
       </w:r>
       <w:r>
         <w:rPr>
@@ -5935,12 +7289,21 @@
         </w:rPr>
         <w:br/>
       </w:r>
-      <w:r>
-        <w:rPr>
-          <w:rStyle w:val="NormalTok"/>
-          <w:rFonts w:ascii="Times New Roman" w:hAnsi="Times New Roman" w:cs="Times New Roman"/>
-        </w:rPr>
-        <w:t xml:space="preserve">parseMethod </w:t>
+      <w:proofErr w:type="spellStart"/>
+      <w:r>
+        <w:rPr>
+          <w:rStyle w:val="NormalTok"/>
+          <w:rFonts w:ascii="Times New Roman" w:hAnsi="Times New Roman" w:cs="Times New Roman"/>
+        </w:rPr>
+        <w:t>parseMethod</w:t>
+      </w:r>
+      <w:proofErr w:type="spellEnd"/>
+      <w:r>
+        <w:rPr>
+          <w:rStyle w:val="NormalTok"/>
+          <w:rFonts w:ascii="Times New Roman" w:hAnsi="Times New Roman" w:cs="Times New Roman"/>
+        </w:rPr>
+        <w:t xml:space="preserve"> </w:t>
       </w:r>
       <w:r>
         <w:rPr>
@@ -5997,12 +7360,21 @@
         </w:rPr>
         <w:br/>
       </w:r>
-      <w:r>
-        <w:rPr>
-          <w:rStyle w:val="NormalTok"/>
-          <w:rFonts w:ascii="Times New Roman" w:hAnsi="Times New Roman" w:cs="Times New Roman"/>
-        </w:rPr>
-        <w:t xml:space="preserve">parseMethod other     </w:t>
+      <w:proofErr w:type="spellStart"/>
+      <w:r>
+        <w:rPr>
+          <w:rStyle w:val="NormalTok"/>
+          <w:rFonts w:ascii="Times New Roman" w:hAnsi="Times New Roman" w:cs="Times New Roman"/>
+        </w:rPr>
+        <w:t>parseMethod</w:t>
+      </w:r>
+      <w:proofErr w:type="spellEnd"/>
+      <w:r>
+        <w:rPr>
+          <w:rStyle w:val="NormalTok"/>
+          <w:rFonts w:ascii="Times New Roman" w:hAnsi="Times New Roman" w:cs="Times New Roman"/>
+        </w:rPr>
+        <w:t xml:space="preserve"> other     </w:t>
       </w:r>
       <w:r>
         <w:rPr>
@@ -6076,7 +7448,7 @@
         </w:rPr>
       </w:pPr>
       <w:bookmarkStart w:id="23" w:name="expected-outputs-and-possible-extensions"/>
-      <w:bookmarkEnd w:id="11"/>
+      <w:bookmarkEnd w:id="12"/>
       <w:bookmarkEnd w:id="22"/>
       <w:r>
         <w:rPr>
@@ -6181,6 +7553,7 @@
           <w:rStyle w:val="VerbatimChar"/>
           <w:rFonts w:ascii="Times New Roman" w:hAnsi="Times New Roman" w:cs="Times New Roman"/>
         </w:rPr>
+        <w:lastRenderedPageBreak/>
         <w:t>Successful Parses:     20</w:t>
       </w:r>
       <w:r>
@@ -6207,7 +7580,6 @@
           <w:rStyle w:val="VerbatimChar"/>
           <w:rFonts w:ascii="Times New Roman" w:hAnsi="Times New Roman" w:cs="Times New Roman"/>
         </w:rPr>
-        <w:lastRenderedPageBreak/>
         <w:t>--------------------------------------------</w:t>
       </w:r>
       <w:r>
@@ -6247,7 +7619,23 @@
           <w:rStyle w:val="VerbatimChar"/>
           <w:rFonts w:ascii="Times New Roman" w:hAnsi="Times New Roman" w:cs="Times New Roman"/>
         </w:rPr>
-        <w:t xml:space="preserve">  ClientError     : 1</w:t>
+        <w:t xml:space="preserve">  </w:t>
+      </w:r>
+      <w:proofErr w:type="spellStart"/>
+      <w:r>
+        <w:rPr>
+          <w:rStyle w:val="VerbatimChar"/>
+          <w:rFonts w:ascii="Times New Roman" w:hAnsi="Times New Roman" w:cs="Times New Roman"/>
+        </w:rPr>
+        <w:t>ClientError</w:t>
+      </w:r>
+      <w:proofErr w:type="spellEnd"/>
+      <w:r>
+        <w:rPr>
+          <w:rStyle w:val="VerbatimChar"/>
+          <w:rFonts w:ascii="Times New Roman" w:hAnsi="Times New Roman" w:cs="Times New Roman"/>
+        </w:rPr>
+        <w:t xml:space="preserve">     : 1</w:t>
       </w:r>
       <w:r>
         <w:rPr>
@@ -6656,7 +8044,21 @@
         <w:rPr>
           <w:rFonts w:ascii="Times New Roman" w:hAnsi="Times New Roman" w:cs="Times New Roman"/>
         </w:rPr>
-        <w:t>Integrate with GeoIP databases</w:t>
+        <w:t xml:space="preserve">Integrate with </w:t>
+      </w:r>
+      <w:proofErr w:type="spellStart"/>
+      <w:r>
+        <w:rPr>
+          <w:rFonts w:ascii="Times New Roman" w:hAnsi="Times New Roman" w:cs="Times New Roman"/>
+        </w:rPr>
+        <w:t>GeoIP</w:t>
+      </w:r>
+      <w:proofErr w:type="spellEnd"/>
+      <w:r>
+        <w:rPr>
+          <w:rFonts w:ascii="Times New Roman" w:hAnsi="Times New Roman" w:cs="Times New Roman"/>
+        </w:rPr>
+        <w:t xml:space="preserve"> databases</w:t>
       </w:r>
     </w:p>
     <w:p>
@@ -6808,7 +8210,6 @@
           <w:rFonts w:ascii="Times New Roman" w:hAnsi="Times New Roman" w:cs="Times New Roman"/>
           <w:color w:val="auto"/>
         </w:rPr>
-        <w:lastRenderedPageBreak/>
         <w:t>5. Why Functional Programming Improves Reliability and Concurrency</w:t>
       </w:r>
     </w:p>
@@ -6866,12 +8267,21 @@
           <w:rFonts w:ascii="Times New Roman" w:hAnsi="Times New Roman" w:cs="Times New Roman"/>
         </w:rPr>
       </w:pPr>
-      <w:r>
-        <w:rPr>
-          <w:rStyle w:val="NormalTok"/>
-          <w:rFonts w:ascii="Times New Roman" w:hAnsi="Times New Roman" w:cs="Times New Roman"/>
-        </w:rPr>
-        <w:t xml:space="preserve">statusCategory </w:t>
+      <w:proofErr w:type="spellStart"/>
+      <w:r>
+        <w:rPr>
+          <w:rStyle w:val="NormalTok"/>
+          <w:rFonts w:ascii="Times New Roman" w:hAnsi="Times New Roman" w:cs="Times New Roman"/>
+        </w:rPr>
+        <w:t>statusCategory</w:t>
+      </w:r>
+      <w:proofErr w:type="spellEnd"/>
+      <w:r>
+        <w:rPr>
+          <w:rStyle w:val="NormalTok"/>
+          <w:rFonts w:ascii="Times New Roman" w:hAnsi="Times New Roman" w:cs="Times New Roman"/>
+        </w:rPr>
+        <w:t xml:space="preserve"> </w:t>
       </w:r>
       <w:r>
         <w:rPr>
@@ -6901,8 +8311,25 @@
           <w:rStyle w:val="NormalTok"/>
           <w:rFonts w:ascii="Times New Roman" w:hAnsi="Times New Roman" w:cs="Times New Roman"/>
         </w:rPr>
-        <w:t xml:space="preserve"> statusCategory </w:t>
-      </w:r>
+        <w:t xml:space="preserve"> </w:t>
+      </w:r>
+      <w:proofErr w:type="spellStart"/>
+      <w:r>
+        <w:rPr>
+          <w:rStyle w:val="NormalTok"/>
+          <w:rFonts w:ascii="Times New Roman" w:hAnsi="Times New Roman" w:cs="Times New Roman"/>
+        </w:rPr>
+        <w:t>statusCategory</w:t>
+      </w:r>
+      <w:proofErr w:type="spellEnd"/>
+      <w:r>
+        <w:rPr>
+          <w:rStyle w:val="NormalTok"/>
+          <w:rFonts w:ascii="Times New Roman" w:hAnsi="Times New Roman" w:cs="Times New Roman"/>
+        </w:rPr>
+        <w:t xml:space="preserve"> </w:t>
+      </w:r>
+      <w:proofErr w:type="gramStart"/>
       <w:r>
         <w:rPr>
           <w:rStyle w:val="DecValTok"/>
@@ -6926,7 +8353,18 @@
           <w:iCs/>
           <w:color w:val="auto"/>
         </w:rPr>
-        <w:t>-- Always true</w:t>
+        <w:t>--</w:t>
+      </w:r>
+      <w:proofErr w:type="gramEnd"/>
+      <w:r>
+        <w:rPr>
+          <w:rStyle w:val="CommentTok"/>
+          <w:rFonts w:ascii="Times New Roman" w:hAnsi="Times New Roman" w:cs="Times New Roman"/>
+          <w:i w:val="0"/>
+          <w:iCs/>
+          <w:color w:val="auto"/>
+        </w:rPr>
+        <w:t xml:space="preserve"> Always true</w:t>
       </w:r>
     </w:p>
     <w:p>
@@ -6940,7 +8378,14 @@
         <w:rPr>
           <w:rFonts w:ascii="Times New Roman" w:hAnsi="Times New Roman" w:cs="Times New Roman"/>
         </w:rPr>
-        <w:t>This enables</w:t>
+        <w:t xml:space="preserve">This </w:t>
+      </w:r>
+      <w:proofErr w:type="gramStart"/>
+      <w:r>
+        <w:rPr>
+          <w:rFonts w:ascii="Times New Roman" w:hAnsi="Times New Roman" w:cs="Times New Roman"/>
+        </w:rPr>
+        <w:t>enables</w:t>
       </w:r>
       <w:r>
         <w:rPr>
@@ -6966,33 +8411,22 @@
           <w:b/>
           <w:bCs/>
         </w:rPr>
-        <w:t>Deterministic testing</w:t>
-      </w:r>
-      <w:r>
-        <w:rPr>
-          <w:rFonts w:ascii="Times New Roman" w:hAnsi="Times New Roman" w:cs="Times New Roman"/>
-        </w:rPr>
-        <w:t>: Same inputs always yield same results</w:t>
-      </w:r>
-      <w:r>
-        <w:rPr>
-          <w:rFonts w:ascii="Times New Roman" w:hAnsi="Times New Roman" w:cs="Times New Roman"/>
-        </w:rPr>
-        <w:t xml:space="preserve">, </w:t>
-      </w:r>
+        <w:t>Deterministic</w:t>
+      </w:r>
+      <w:proofErr w:type="gramEnd"/>
       <w:r>
         <w:rPr>
           <w:rFonts w:ascii="Times New Roman" w:hAnsi="Times New Roman" w:cs="Times New Roman"/>
           <w:b/>
           <w:bCs/>
         </w:rPr>
-        <w:t>Memoization</w:t>
-      </w:r>
-      <w:r>
-        <w:rPr>
-          <w:rFonts w:ascii="Times New Roman" w:hAnsi="Times New Roman" w:cs="Times New Roman"/>
-        </w:rPr>
-        <w:t>: Safely cache function results</w:t>
+        <w:t xml:space="preserve"> testing</w:t>
+      </w:r>
+      <w:r>
+        <w:rPr>
+          <w:rFonts w:ascii="Times New Roman" w:hAnsi="Times New Roman" w:cs="Times New Roman"/>
+        </w:rPr>
+        <w:t>: Same inputs always yield same results</w:t>
       </w:r>
       <w:r>
         <w:rPr>
@@ -7000,69 +8434,41 @@
         </w:rPr>
         <w:t xml:space="preserve">, </w:t>
       </w:r>
+      <w:proofErr w:type="spellStart"/>
       <w:r>
         <w:rPr>
           <w:rFonts w:ascii="Times New Roman" w:hAnsi="Times New Roman" w:cs="Times New Roman"/>
           <w:b/>
           <w:bCs/>
         </w:rPr>
-        <w:t>Equational reasoning</w:t>
-      </w:r>
-      <w:r>
-        <w:rPr>
-          <w:rFonts w:ascii="Times New Roman" w:hAnsi="Times New Roman" w:cs="Times New Roman"/>
-        </w:rPr>
-        <w:t>: Substitute function calls with their values</w:t>
-      </w:r>
-    </w:p>
-    <w:p>
-      <w:pPr>
-        <w:pStyle w:val="BodyText"/>
-        <w:rPr>
-          <w:rFonts w:ascii="Times New Roman" w:hAnsi="Times New Roman" w:cs="Times New Roman"/>
-        </w:rPr>
-      </w:pPr>
+        <w:t>Memoization</w:t>
+      </w:r>
+      <w:proofErr w:type="spellEnd"/>
+      <w:r>
+        <w:rPr>
+          <w:rFonts w:ascii="Times New Roman" w:hAnsi="Times New Roman" w:cs="Times New Roman"/>
+        </w:rPr>
+        <w:t>: Safely cache function results</w:t>
+      </w:r>
+      <w:r>
+        <w:rPr>
+          <w:rFonts w:ascii="Times New Roman" w:hAnsi="Times New Roman" w:cs="Times New Roman"/>
+        </w:rPr>
+        <w:t xml:space="preserve">, </w:t>
+      </w:r>
       <w:r>
         <w:rPr>
           <w:rFonts w:ascii="Times New Roman" w:hAnsi="Times New Roman" w:cs="Times New Roman"/>
           <w:b/>
           <w:bCs/>
         </w:rPr>
-        <w:t>2. Type Safety</w:t>
-      </w:r>
-    </w:p>
-    <w:p>
-      <w:pPr>
-        <w:pStyle w:val="BodyText"/>
-        <w:rPr>
-          <w:rFonts w:ascii="Times New Roman" w:hAnsi="Times New Roman" w:cs="Times New Roman"/>
-        </w:rPr>
-      </w:pPr>
-      <w:r>
-        <w:rPr>
-          <w:rFonts w:ascii="Times New Roman" w:hAnsi="Times New Roman" w:cs="Times New Roman"/>
-        </w:rPr>
-        <w:t>The compiler prevents entire classes of errors:</w:t>
-      </w:r>
-    </w:p>
-    <w:p>
-      <w:pPr>
-        <w:pStyle w:val="FirstParagraph"/>
-        <w:rPr>
-          <w:rFonts w:ascii="Times New Roman" w:hAnsi="Times New Roman" w:cs="Times New Roman"/>
-        </w:rPr>
-      </w:pPr>
-      <w:r>
-        <w:rPr>
-          <w:rFonts w:ascii="Times New Roman" w:hAnsi="Times New Roman" w:cs="Times New Roman"/>
-        </w:rPr>
-        <w:t>Real-world impact</w:t>
-      </w:r>
-      <w:r>
-        <w:rPr>
-          <w:rFonts w:ascii="Times New Roman" w:hAnsi="Times New Roman" w:cs="Times New Roman"/>
-        </w:rPr>
-        <w:t>: Zero null pointer exceptions, zero type coercion bugs.</w:t>
+        <w:t>Equational reasoning</w:t>
+      </w:r>
+      <w:r>
+        <w:rPr>
+          <w:rFonts w:ascii="Times New Roman" w:hAnsi="Times New Roman" w:cs="Times New Roman"/>
+        </w:rPr>
+        <w:t>: Substitute function calls with their values</w:t>
       </w:r>
     </w:p>
     <w:p>
@@ -7078,7 +8484,7 @@
           <w:b/>
           <w:bCs/>
         </w:rPr>
-        <w:t>3. Immutability Guarantees</w:t>
+        <w:t>2. Type Safety</w:t>
       </w:r>
     </w:p>
     <w:p>
@@ -7092,7 +8498,7 @@
         <w:rPr>
           <w:rFonts w:ascii="Times New Roman" w:hAnsi="Times New Roman" w:cs="Times New Roman"/>
         </w:rPr>
-        <w:t>Once data is created, it cannot be modified:</w:t>
+        <w:t>The compiler prevents entire classes of errors:</w:t>
       </w:r>
     </w:p>
     <w:p>
@@ -7106,7 +8512,13 @@
         <w:rPr>
           <w:rFonts w:ascii="Times New Roman" w:hAnsi="Times New Roman" w:cs="Times New Roman"/>
         </w:rPr>
-        <w:t>Benefits: - No defensive copying needed - Easier debugging (data doesn’t change under you)  Safe sharing between threads</w:t>
+        <w:t>Real-world impact</w:t>
+      </w:r>
+      <w:r>
+        <w:rPr>
+          <w:rFonts w:ascii="Times New Roman" w:hAnsi="Times New Roman" w:cs="Times New Roman"/>
+        </w:rPr>
+        <w:t>: Zero null pointer exceptions, zero type coercion bugs.</w:t>
       </w:r>
     </w:p>
     <w:p>
@@ -7122,7 +8534,7 @@
           <w:b/>
           <w:bCs/>
         </w:rPr>
-        <w:t>4. Explicit Effect Management</w:t>
+        <w:t>3. Immutability Guarantees</w:t>
       </w:r>
     </w:p>
     <w:p>
@@ -7136,7 +8548,7 @@
         <w:rPr>
           <w:rFonts w:ascii="Times New Roman" w:hAnsi="Times New Roman" w:cs="Times New Roman"/>
         </w:rPr>
-        <w:t>The type system distinguishes pure from impure code:</w:t>
+        <w:t>Once data is created, it cannot be modified:</w:t>
       </w:r>
     </w:p>
     <w:p>
@@ -7150,14 +8562,72 @@
         <w:rPr>
           <w:rFonts w:ascii="Times New Roman" w:hAnsi="Times New Roman" w:cs="Times New Roman"/>
         </w:rPr>
-        <w:t xml:space="preserve">This makes code behavior </w:t>
-      </w:r>
+        <w:t xml:space="preserve">Benefits: - No defensive copying needed - Easier debugging (data doesn’t change under </w:t>
+      </w:r>
+      <w:proofErr w:type="gramStart"/>
+      <w:r>
+        <w:rPr>
+          <w:rFonts w:ascii="Times New Roman" w:hAnsi="Times New Roman" w:cs="Times New Roman"/>
+        </w:rPr>
+        <w:t>you)  Safe</w:t>
+      </w:r>
+      <w:proofErr w:type="gramEnd"/>
+      <w:r>
+        <w:rPr>
+          <w:rFonts w:ascii="Times New Roman" w:hAnsi="Times New Roman" w:cs="Times New Roman"/>
+        </w:rPr>
+        <w:t xml:space="preserve"> sharing between threads</w:t>
+      </w:r>
+    </w:p>
+    <w:p>
+      <w:pPr>
+        <w:pStyle w:val="BodyText"/>
+        <w:rPr>
+          <w:rFonts w:ascii="Times New Roman" w:hAnsi="Times New Roman" w:cs="Times New Roman"/>
+        </w:rPr>
+      </w:pPr>
       <w:r>
         <w:rPr>
           <w:rFonts w:ascii="Times New Roman" w:hAnsi="Times New Roman" w:cs="Times New Roman"/>
           <w:b/>
           <w:bCs/>
         </w:rPr>
+        <w:t>4. Explicit Effect Management</w:t>
+      </w:r>
+    </w:p>
+    <w:p>
+      <w:pPr>
+        <w:pStyle w:val="BodyText"/>
+        <w:rPr>
+          <w:rFonts w:ascii="Times New Roman" w:hAnsi="Times New Roman" w:cs="Times New Roman"/>
+        </w:rPr>
+      </w:pPr>
+      <w:r>
+        <w:rPr>
+          <w:rFonts w:ascii="Times New Roman" w:hAnsi="Times New Roman" w:cs="Times New Roman"/>
+        </w:rPr>
+        <w:t>The type system distinguishes pure from impure code:</w:t>
+      </w:r>
+    </w:p>
+    <w:p>
+      <w:pPr>
+        <w:pStyle w:val="FirstParagraph"/>
+        <w:rPr>
+          <w:rFonts w:ascii="Times New Roman" w:hAnsi="Times New Roman" w:cs="Times New Roman"/>
+        </w:rPr>
+      </w:pPr>
+      <w:r>
+        <w:rPr>
+          <w:rFonts w:ascii="Times New Roman" w:hAnsi="Times New Roman" w:cs="Times New Roman"/>
+        </w:rPr>
+        <w:t xml:space="preserve">This makes code behavior </w:t>
+      </w:r>
+      <w:r>
+        <w:rPr>
+          <w:rFonts w:ascii="Times New Roman" w:hAnsi="Times New Roman" w:cs="Times New Roman"/>
+          <w:b/>
+          <w:bCs/>
+        </w:rPr>
         <w:t>explicit and auditable</w:t>
       </w:r>
       <w:r>
@@ -7241,12 +8711,21 @@
         </w:rPr>
         <w:br/>
       </w:r>
-      <w:r>
-        <w:rPr>
-          <w:rStyle w:val="NormalTok"/>
-          <w:rFonts w:ascii="Times New Roman" w:hAnsi="Times New Roman" w:cs="Times New Roman"/>
-        </w:rPr>
-        <w:t xml:space="preserve">sessionize timeout entries </w:t>
+      <w:proofErr w:type="spellStart"/>
+      <w:r>
+        <w:rPr>
+          <w:rStyle w:val="NormalTok"/>
+          <w:rFonts w:ascii="Times New Roman" w:hAnsi="Times New Roman" w:cs="Times New Roman"/>
+        </w:rPr>
+        <w:t>sessionize</w:t>
+      </w:r>
+      <w:proofErr w:type="spellEnd"/>
+      <w:r>
+        <w:rPr>
+          <w:rStyle w:val="NormalTok"/>
+          <w:rFonts w:ascii="Times New Roman" w:hAnsi="Times New Roman" w:cs="Times New Roman"/>
+        </w:rPr>
+        <w:t xml:space="preserve"> timeout entries </w:t>
       </w:r>
       <w:r>
         <w:rPr>
@@ -7268,6 +8747,7 @@
         </w:rPr>
         <w:t xml:space="preserve">  </w:t>
       </w:r>
+      <w:proofErr w:type="spellStart"/>
       <w:r>
         <w:rPr>
           <w:rStyle w:val="FunctionTok"/>
@@ -7275,12 +8755,45 @@
         </w:rPr>
         <w:t>concatMap</w:t>
       </w:r>
-      <w:r>
-        <w:rPr>
-          <w:rStyle w:val="NormalTok"/>
-          <w:rFonts w:ascii="Times New Roman" w:hAnsi="Times New Roman" w:cs="Times New Roman"/>
-        </w:rPr>
-        <w:t xml:space="preserve"> sessionizeIP groupedByIP </w:t>
+      <w:proofErr w:type="spellEnd"/>
+      <w:r>
+        <w:rPr>
+          <w:rStyle w:val="NormalTok"/>
+          <w:rFonts w:ascii="Times New Roman" w:hAnsi="Times New Roman" w:cs="Times New Roman"/>
+        </w:rPr>
+        <w:t xml:space="preserve"> </w:t>
+      </w:r>
+      <w:proofErr w:type="spellStart"/>
+      <w:r>
+        <w:rPr>
+          <w:rStyle w:val="NormalTok"/>
+          <w:rFonts w:ascii="Times New Roman" w:hAnsi="Times New Roman" w:cs="Times New Roman"/>
+        </w:rPr>
+        <w:t>sessionizeIP</w:t>
+      </w:r>
+      <w:proofErr w:type="spellEnd"/>
+      <w:r>
+        <w:rPr>
+          <w:rStyle w:val="NormalTok"/>
+          <w:rFonts w:ascii="Times New Roman" w:hAnsi="Times New Roman" w:cs="Times New Roman"/>
+        </w:rPr>
+        <w:t xml:space="preserve"> </w:t>
+      </w:r>
+      <w:proofErr w:type="spellStart"/>
+      <w:r>
+        <w:rPr>
+          <w:rStyle w:val="NormalTok"/>
+          <w:rFonts w:ascii="Times New Roman" w:hAnsi="Times New Roman" w:cs="Times New Roman"/>
+        </w:rPr>
+        <w:t>groupedByIP</w:t>
+      </w:r>
+      <w:proofErr w:type="spellEnd"/>
+      <w:r>
+        <w:rPr>
+          <w:rStyle w:val="NormalTok"/>
+          <w:rFonts w:ascii="Times New Roman" w:hAnsi="Times New Roman" w:cs="Times New Roman"/>
+        </w:rPr>
+        <w:t xml:space="preserve"> </w:t>
       </w:r>
       <w:r>
         <w:rPr>
@@ -7294,7 +8807,23 @@
           <w:rStyle w:val="NormalTok"/>
           <w:rFonts w:ascii="Times New Roman" w:hAnsi="Times New Roman" w:cs="Times New Roman"/>
         </w:rPr>
-        <w:t xml:space="preserve"> parBuffer </w:t>
+        <w:t xml:space="preserve"> </w:t>
+      </w:r>
+      <w:proofErr w:type="spellStart"/>
+      <w:r>
+        <w:rPr>
+          <w:rStyle w:val="NormalTok"/>
+          <w:rFonts w:ascii="Times New Roman" w:hAnsi="Times New Roman" w:cs="Times New Roman"/>
+        </w:rPr>
+        <w:t>parBuffer</w:t>
+      </w:r>
+      <w:proofErr w:type="spellEnd"/>
+      <w:r>
+        <w:rPr>
+          <w:rStyle w:val="NormalTok"/>
+          <w:rFonts w:ascii="Times New Roman" w:hAnsi="Times New Roman" w:cs="Times New Roman"/>
+        </w:rPr>
+        <w:t xml:space="preserve"> </w:t>
       </w:r>
       <w:r>
         <w:rPr>
@@ -7308,8 +8837,17 @@
           <w:rStyle w:val="NormalTok"/>
           <w:rFonts w:ascii="Times New Roman" w:hAnsi="Times New Roman" w:cs="Times New Roman"/>
         </w:rPr>
-        <w:t xml:space="preserve"> rseq</w:t>
-      </w:r>
+        <w:t xml:space="preserve"> </w:t>
+      </w:r>
+      <w:proofErr w:type="spellStart"/>
+      <w:r>
+        <w:rPr>
+          <w:rStyle w:val="NormalTok"/>
+          <w:rFonts w:ascii="Times New Roman" w:hAnsi="Times New Roman" w:cs="Times New Roman"/>
+        </w:rPr>
+        <w:t>rseq</w:t>
+      </w:r>
+      <w:proofErr w:type="spellEnd"/>
     </w:p>
     <w:p>
       <w:pPr>
@@ -7415,7 +8953,23 @@
           <w:rStyle w:val="NormalTok"/>
           <w:rFonts w:ascii="Times New Roman" w:hAnsi="Times New Roman" w:cs="Times New Roman"/>
         </w:rPr>
-        <w:t xml:space="preserve"> processLogs entries</w:t>
+        <w:t xml:space="preserve"> </w:t>
+      </w:r>
+      <w:proofErr w:type="spellStart"/>
+      <w:r>
+        <w:rPr>
+          <w:rStyle w:val="NormalTok"/>
+          <w:rFonts w:ascii="Times New Roman" w:hAnsi="Times New Roman" w:cs="Times New Roman"/>
+        </w:rPr>
+        <w:t>processLogs</w:t>
+      </w:r>
+      <w:proofErr w:type="spellEnd"/>
+      <w:r>
+        <w:rPr>
+          <w:rStyle w:val="NormalTok"/>
+          <w:rFonts w:ascii="Times New Roman" w:hAnsi="Times New Roman" w:cs="Times New Roman"/>
+        </w:rPr>
+        <w:t xml:space="preserve"> entries</w:t>
       </w:r>
       <w:r>
         <w:rPr>
@@ -7449,7 +9003,23 @@
           <w:rStyle w:val="NormalTok"/>
           <w:rFonts w:ascii="Times New Roman" w:hAnsi="Times New Roman" w:cs="Times New Roman"/>
         </w:rPr>
-        <w:t xml:space="preserve"> computeAnomalies entries</w:t>
+        <w:t xml:space="preserve"> </w:t>
+      </w:r>
+      <w:proofErr w:type="spellStart"/>
+      <w:r>
+        <w:rPr>
+          <w:rStyle w:val="NormalTok"/>
+          <w:rFonts w:ascii="Times New Roman" w:hAnsi="Times New Roman" w:cs="Times New Roman"/>
+        </w:rPr>
+        <w:t>computeAnomalies</w:t>
+      </w:r>
+      <w:proofErr w:type="spellEnd"/>
+      <w:r>
+        <w:rPr>
+          <w:rStyle w:val="NormalTok"/>
+          <w:rFonts w:ascii="Times New Roman" w:hAnsi="Times New Roman" w:cs="Times New Roman"/>
+        </w:rPr>
+        <w:t xml:space="preserve"> entries</w:t>
       </w:r>
     </w:p>
     <w:p>
@@ -7479,6 +9049,7 @@
           <w:b/>
           <w:bCs/>
         </w:rPr>
+        <w:lastRenderedPageBreak/>
         <w:t>3. Scalability</w:t>
       </w:r>
     </w:p>
@@ -7493,7 +9064,6 @@
         <w:rPr>
           <w:rFonts w:ascii="Times New Roman" w:hAnsi="Times New Roman" w:cs="Times New Roman"/>
         </w:rPr>
-        <w:lastRenderedPageBreak/>
         <w:t>The log analyzer automatically scales to available CPU cores</w:t>
       </w:r>
     </w:p>
@@ -7562,12 +9132,21 @@
           <w:rFonts w:ascii="Times New Roman" w:hAnsi="Times New Roman" w:cs="Times New Roman"/>
         </w:rPr>
       </w:pPr>
-      <w:r>
-        <w:rPr>
-          <w:rStyle w:val="NormalTok"/>
-          <w:rFonts w:ascii="Times New Roman" w:hAnsi="Times New Roman" w:cs="Times New Roman"/>
-        </w:rPr>
-        <w:t xml:space="preserve">parBuffer </w:t>
+      <w:proofErr w:type="spellStart"/>
+      <w:r>
+        <w:rPr>
+          <w:rStyle w:val="NormalTok"/>
+          <w:rFonts w:ascii="Times New Roman" w:hAnsi="Times New Roman" w:cs="Times New Roman"/>
+        </w:rPr>
+        <w:t>parBuffer</w:t>
+      </w:r>
+      <w:proofErr w:type="spellEnd"/>
+      <w:r>
+        <w:rPr>
+          <w:rStyle w:val="NormalTok"/>
+          <w:rFonts w:ascii="Times New Roman" w:hAnsi="Times New Roman" w:cs="Times New Roman"/>
+        </w:rPr>
+        <w:t xml:space="preserve"> </w:t>
       </w:r>
       <w:r>
         <w:rPr>
@@ -7581,14 +9160,39 @@
           <w:rStyle w:val="NormalTok"/>
           <w:rFonts w:ascii="Times New Roman" w:hAnsi="Times New Roman" w:cs="Times New Roman"/>
         </w:rPr>
-        <w:t xml:space="preserve"> rseq  </w:t>
+        <w:t xml:space="preserve"> </w:t>
+      </w:r>
+      <w:proofErr w:type="spellStart"/>
+      <w:proofErr w:type="gramStart"/>
+      <w:r>
+        <w:rPr>
+          <w:rStyle w:val="NormalTok"/>
+          <w:rFonts w:ascii="Times New Roman" w:hAnsi="Times New Roman" w:cs="Times New Roman"/>
+        </w:rPr>
+        <w:t>rseq</w:t>
+      </w:r>
+      <w:proofErr w:type="spellEnd"/>
+      <w:r>
+        <w:rPr>
+          <w:rStyle w:val="NormalTok"/>
+          <w:rFonts w:ascii="Times New Roman" w:hAnsi="Times New Roman" w:cs="Times New Roman"/>
+        </w:rPr>
+        <w:t xml:space="preserve">  </w:t>
       </w:r>
       <w:r>
         <w:rPr>
           <w:rStyle w:val="CommentTok"/>
           <w:rFonts w:ascii="Times New Roman" w:hAnsi="Times New Roman" w:cs="Times New Roman"/>
         </w:rPr>
-        <w:t>-- Evaluates up to 100 elements in parallel</w:t>
+        <w:t>--</w:t>
+      </w:r>
+      <w:proofErr w:type="gramEnd"/>
+      <w:r>
+        <w:rPr>
+          <w:rStyle w:val="CommentTok"/>
+          <w:rFonts w:ascii="Times New Roman" w:hAnsi="Times New Roman" w:cs="Times New Roman"/>
+        </w:rPr>
+        <w:t xml:space="preserve"> Evaluates up to 100 elements in parallel</w:t>
       </w:r>
       <w:r>
         <w:rPr>
@@ -7596,12 +9200,37 @@
         </w:rPr>
         <w:br/>
       </w:r>
-      <w:r>
-        <w:rPr>
-          <w:rStyle w:val="NormalTok"/>
-          <w:rFonts w:ascii="Times New Roman" w:hAnsi="Times New Roman" w:cs="Times New Roman"/>
-        </w:rPr>
-        <w:t xml:space="preserve">parList rdeepseq    </w:t>
+      <w:proofErr w:type="spellStart"/>
+      <w:r>
+        <w:rPr>
+          <w:rStyle w:val="NormalTok"/>
+          <w:rFonts w:ascii="Times New Roman" w:hAnsi="Times New Roman" w:cs="Times New Roman"/>
+        </w:rPr>
+        <w:t>parList</w:t>
+      </w:r>
+      <w:proofErr w:type="spellEnd"/>
+      <w:r>
+        <w:rPr>
+          <w:rStyle w:val="NormalTok"/>
+          <w:rFonts w:ascii="Times New Roman" w:hAnsi="Times New Roman" w:cs="Times New Roman"/>
+        </w:rPr>
+        <w:t xml:space="preserve"> </w:t>
+      </w:r>
+      <w:proofErr w:type="spellStart"/>
+      <w:r>
+        <w:rPr>
+          <w:rStyle w:val="NormalTok"/>
+          <w:rFonts w:ascii="Times New Roman" w:hAnsi="Times New Roman" w:cs="Times New Roman"/>
+        </w:rPr>
+        <w:t>rdeepseq</w:t>
+      </w:r>
+      <w:proofErr w:type="spellEnd"/>
+      <w:r>
+        <w:rPr>
+          <w:rStyle w:val="NormalTok"/>
+          <w:rFonts w:ascii="Times New Roman" w:hAnsi="Times New Roman" w:cs="Times New Roman"/>
+        </w:rPr>
+        <w:t xml:space="preserve">    </w:t>
       </w:r>
       <w:r>
         <w:rPr>
@@ -10120,6 +11749,17 @@
       <w:szCs w:val="18"/>
     </w:rPr>
   </w:style>
+  <w:style w:type="character" w:styleId="FollowedHyperlink">
+    <w:name w:val="FollowedHyperlink"/>
+    <w:basedOn w:val="DefaultParagraphFont"/>
+    <w:semiHidden/>
+    <w:unhideWhenUsed/>
+    <w:rsid w:val="00130500"/>
+    <w:rPr>
+      <w:color w:val="800080" w:themeColor="followedHyperlink"/>
+      <w:u w:val="single"/>
+    </w:rPr>
+  </w:style>
 </w:styles>
 </file>
 

</xml_diff>